<commit_message>
doc: Architecture and Design
</commit_message>
<xml_diff>
--- a/Report Architecture and Design .docx
+++ b/Report Architecture and Design .docx
@@ -3216,7 +3216,7 @@
       <w:pPr>
         <w:spacing w:line="240" w:lineRule="auto"/>
         <w:rPr>
-          <w:rFonts w:ascii="Times New Roman" w:hAnsi="Times New Roman" w:cs="Times New Roman"/>
+          <w:rFonts w:ascii="Times New Roman" w:hAnsi="Times New Roman" w:cs="Times New Roman" w:hint="eastAsia"/>
           <w:sz w:val="22"/>
           <w:szCs w:val="22"/>
         </w:rPr>
@@ -3243,7 +3243,7 @@
           <w:sz w:val="22"/>
           <w:szCs w:val="22"/>
         </w:rPr>
-        <w:t xml:space="preserve"> are securely tracked in our GitHub repository.</w:t>
+        <w:t xml:space="preserve"> are securely tracked in our GitHub repository</w:t>
       </w:r>
       <w:r>
         <w:rPr>
@@ -3252,6 +3252,25 @@
           <w:szCs w:val="22"/>
         </w:rPr>
         <w:t xml:space="preserve"> </w:t>
+      </w:r>
+      <w:hyperlink r:id="rId12" w:history="1">
+        <w:r>
+          <w:rPr>
+            <w:rStyle w:val="Hyperlink"/>
+            <w:rFonts w:ascii="Times New Roman" w:hAnsi="Times New Roman" w:cs="Times New Roman"/>
+            <w:sz w:val="22"/>
+            <w:szCs w:val="22"/>
+          </w:rPr>
+          <w:t>https://github.com/ucdse/docs/tree/main/UML_files</w:t>
+        </w:r>
+      </w:hyperlink>
+      <w:r>
+        <w:rPr>
+          <w:rFonts w:ascii="Times New Roman" w:hAnsi="Times New Roman" w:cs="Times New Roman"/>
+          <w:sz w:val="22"/>
+          <w:szCs w:val="22"/>
+        </w:rPr>
+        <w:t>.</w:t>
       </w:r>
     </w:p>
     <w:sectPr>
@@ -4358,6 +4377,29 @@
       <w:szCs w:val="18"/>
     </w:rPr>
   </w:style>
+  <w:style w:type="character" w:styleId="Hyperlink">
+    <w:name w:val="Hyperlink"/>
+    <w:basedOn w:val="DefaultParagraphFont"/>
+    <w:uiPriority w:val="99"/>
+    <w:unhideWhenUsed/>
+    <w:rsid w:val="00AE4731"/>
+    <w:rPr>
+      <w:color w:val="467886" w:themeColor="hyperlink"/>
+      <w:u w:val="single"/>
+    </w:rPr>
+  </w:style>
+  <w:style w:type="character" w:styleId="UnresolvedMention">
+    <w:name w:val="Unresolved Mention"/>
+    <w:basedOn w:val="DefaultParagraphFont"/>
+    <w:uiPriority w:val="99"/>
+    <w:semiHidden/>
+    <w:unhideWhenUsed/>
+    <w:rsid w:val="00AE4731"/>
+    <w:rPr>
+      <w:color w:val="605E5C"/>
+      <w:shd w:val="clear" w:color="auto" w:fill="E1DFDD"/>
+    </w:rPr>
+  </w:style>
 </w:styles>
 </file>
 

</xml_diff>

<commit_message>
update model of ml
</commit_message>
<xml_diff>
--- a/Report Architecture and Design .docx
+++ b/Report Architecture and Design .docx
@@ -57,13 +57,9 @@
     <w:p>
       <w:pPr>
         <w:keepNext/>
-        <w:rPr>
-          <w:rFonts w:ascii="Times New Roman" w:hAnsi="Times New Roman" w:cs="Times New Roman"/>
-        </w:rPr>
-      </w:pPr>
-      <w:r>
-        <w:rPr>
-          <w:rFonts w:ascii="Times New Roman" w:hAnsi="Times New Roman" w:cs="Times New Roman"/>
+      </w:pPr>
+      <w:r>
+        <w:rPr>
           <w:noProof/>
         </w:rPr>
         <w:drawing>
@@ -114,16 +110,8 @@
       <w:r>
         <w:rPr>
           <w:rFonts w:ascii="Times New Roman" w:hAnsi="Times New Roman" w:cs="Times New Roman"/>
-          <w:sz w:val="16"/>
-          <w:szCs w:val="16"/>
-        </w:rPr>
-        <w:t>Figure</w:t>
-      </w:r>
-      <w:r>
-        <w:rPr>
-          <w:rFonts w:ascii="Times New Roman" w:hAnsi="Times New Roman" w:cs="Times New Roman"/>
-        </w:rPr>
-        <w:t xml:space="preserve"> </w:t>
+        </w:rPr>
+        <w:t xml:space="preserve">Figure </w:t>
       </w:r>
       <w:r>
         <w:rPr>
@@ -167,14 +155,60 @@
           <w:rFonts w:ascii="Times New Roman" w:hAnsi="Times New Roman" w:cs="Times New Roman"/>
         </w:rPr>
         <w:t xml:space="preserve"> Overall System Architecture</w:t>
+      </w:r>
+    </w:p>
+    <w:p/>
+    <w:p>
+      <w:pPr>
+        <w:spacing w:line="240" w:lineRule="auto"/>
+        <w:rPr>
+          <w:rFonts w:ascii="Times New Roman" w:hAnsi="Times New Roman" w:cs="Times New Roman"/>
+          <w:sz w:val="22"/>
+          <w:szCs w:val="22"/>
+        </w:rPr>
+      </w:pPr>
+      <w:r>
+        <w:rPr>
+          <w:rFonts w:ascii="Times New Roman" w:hAnsi="Times New Roman" w:cs="Times New Roman"/>
+          <w:sz w:val="22"/>
+          <w:szCs w:val="22"/>
+        </w:rPr>
+        <w:t>Our project utilizes a decoupled client-server and cloud architecture, separating the front-end user interfaces, back-end web routing, and the data acquisition processes.</w:t>
       </w:r>
     </w:p>
     <w:p>
       <w:pPr>
-        <w:rPr>
-          <w:rFonts w:ascii="Times New Roman" w:hAnsi="Times New Roman" w:cs="Times New Roman"/>
-        </w:rPr>
-      </w:pPr>
+        <w:spacing w:line="240" w:lineRule="auto"/>
+        <w:rPr>
+          <w:rFonts w:ascii="Times New Roman" w:hAnsi="Times New Roman" w:cs="Times New Roman"/>
+          <w:sz w:val="22"/>
+          <w:szCs w:val="22"/>
+        </w:rPr>
+      </w:pPr>
+      <w:r>
+        <w:rPr>
+          <w:rFonts w:ascii="Times New Roman" w:hAnsi="Times New Roman" w:cs="Times New Roman"/>
+          <w:sz w:val="22"/>
+          <w:szCs w:val="22"/>
+        </w:rPr>
+        <w:t xml:space="preserve">The architecture (Figure </w:t>
+      </w:r>
+      <w:r>
+        <w:rPr>
+          <w:rFonts w:ascii="Times New Roman" w:hAnsi="Times New Roman" w:cs="Times New Roman"/>
+          <w:sz w:val="22"/>
+          <w:szCs w:val="22"/>
+        </w:rPr>
+        <w:t>3.</w:t>
+      </w:r>
+      <w:r>
+        <w:rPr>
+          <w:rFonts w:ascii="Times New Roman" w:hAnsi="Times New Roman" w:cs="Times New Roman"/>
+          <w:sz w:val="22"/>
+          <w:szCs w:val="22"/>
+        </w:rPr>
+        <w:t>1) illustrates a scalable Web application split into three robust functions: user authentication, journey planning, and an AI chatbot.</w:t>
+      </w:r>
     </w:p>
     <w:p>
       <w:pPr>
@@ -191,7 +225,7 @@
           <w:sz w:val="22"/>
           <w:szCs w:val="22"/>
         </w:rPr>
-        <w:t>Our project utilizes a decoupled client-server and cloud architecture, separating the front-end user interfaces, back-end web routing, and the data acquisition processes.</w:t>
+        <w:t>Client Device: A React-based multi-page application (MPA) utilising distinct route pages (/login, /maps, /chat). It communicates to the backend asynchronously via JSON REST APIs seamlessly across the layout.</w:t>
       </w:r>
     </w:p>
     <w:p>
@@ -209,23 +243,7 @@
           <w:sz w:val="22"/>
           <w:szCs w:val="22"/>
         </w:rPr>
-        <w:t xml:space="preserve">The architecture (Figure </w:t>
-      </w:r>
-      <w:r>
-        <w:rPr>
-          <w:rFonts w:ascii="Times New Roman" w:hAnsi="Times New Roman" w:cs="Times New Roman"/>
-          <w:sz w:val="22"/>
-          <w:szCs w:val="22"/>
-        </w:rPr>
-        <w:t>3.</w:t>
-      </w:r>
-      <w:r>
-        <w:rPr>
-          <w:rFonts w:ascii="Times New Roman" w:hAnsi="Times New Roman" w:cs="Times New Roman"/>
-          <w:sz w:val="22"/>
-          <w:szCs w:val="22"/>
-        </w:rPr>
-        <w:t>1) illustrates a scalable Web application split into three robust functions: user authentication, journey planning, and an AI chatbot.</w:t>
+        <w:t>Server Environment (AWS EC2): A scalable AWS EC2 micro instance hosts our core Python layer.</w:t>
       </w:r>
     </w:p>
     <w:p>
@@ -243,7 +261,7 @@
           <w:sz w:val="22"/>
           <w:szCs w:val="22"/>
         </w:rPr>
-        <w:t>Client Device: A React-based multi-page application (MPA) utilising distinct route pages (/login, /maps, /chat). It communicates to the backend asynchronously via JSON REST APIs seamlessly across the layout.</w:t>
+        <w:t>Flask Backend Server: Acts as the traffic controller, routing API requests, formatting data, and calling our predictive models.</w:t>
       </w:r>
     </w:p>
     <w:p>
@@ -261,7 +279,7 @@
           <w:sz w:val="22"/>
           <w:szCs w:val="22"/>
         </w:rPr>
-        <w:t>Server Environment (AWS EC2): A scalable AWS EC2 micro instance hosts our core Python layer.</w:t>
+        <w:t>Background Scrapers: Standalone scripts continuously gather live data from the JCDecaux API and OpenWeatherMap API, pushing raw data into our database independently of the Web Server.</w:t>
       </w:r>
     </w:p>
     <w:p>
@@ -279,7 +297,7 @@
           <w:sz w:val="22"/>
           <w:szCs w:val="22"/>
         </w:rPr>
-        <w:t>Flask Backend Server: Acts as the traffic controller, routing API requests, formatting data, and calling our predictive models.</w:t>
+        <w:t>Database Layer (AWS RDS): A managed, centralised AWS RDS MySQL instance that securely maintains static station references, dynamic availability histories, and weather data independent of the EC2 lifecycle.</w:t>
       </w:r>
     </w:p>
     <w:p>
@@ -297,25 +315,7 @@
           <w:sz w:val="22"/>
           <w:szCs w:val="22"/>
         </w:rPr>
-        <w:t xml:space="preserve">Background Scrapers: Standalone scripts continuously gather live data from the JCDecaux API and </w:t>
-      </w:r>
-      <w:proofErr w:type="spellStart"/>
-      <w:r>
-        <w:rPr>
-          <w:rFonts w:ascii="Times New Roman" w:hAnsi="Times New Roman" w:cs="Times New Roman"/>
-          <w:sz w:val="22"/>
-          <w:szCs w:val="22"/>
-        </w:rPr>
-        <w:t>OpenWeatherMap</w:t>
-      </w:r>
-      <w:proofErr w:type="spellEnd"/>
-      <w:r>
-        <w:rPr>
-          <w:rFonts w:ascii="Times New Roman" w:hAnsi="Times New Roman" w:cs="Times New Roman"/>
-          <w:sz w:val="22"/>
-          <w:szCs w:val="22"/>
-        </w:rPr>
-        <w:t xml:space="preserve"> API, pushing raw data into our database independently of the Web Server.</w:t>
+        <w:t>This separation of concerns guarantees that long-running data-fetching tasks don't block API responses, and ensures that the client remains highly responsive.</w:t>
       </w:r>
     </w:p>
     <w:p>
@@ -327,14 +327,6 @@
           <w:szCs w:val="22"/>
         </w:rPr>
       </w:pPr>
-      <w:r>
-        <w:rPr>
-          <w:rFonts w:ascii="Times New Roman" w:hAnsi="Times New Roman" w:cs="Times New Roman"/>
-          <w:sz w:val="22"/>
-          <w:szCs w:val="22"/>
-        </w:rPr>
-        <w:t>Database Layer (AWS RDS): A managed, centralised AWS RDS MySQL instance that securely maintains static station references, dynamic availability histories, and weather data independent of the EC2 lifecycle.</w:t>
-      </w:r>
     </w:p>
     <w:p>
       <w:pPr>
@@ -351,7 +343,31 @@
           <w:sz w:val="22"/>
           <w:szCs w:val="22"/>
         </w:rPr>
-        <w:t>This separation of concerns guarantees that long-running data-fetching tasks don't block API responses, and ensures that the client remains highly responsive.</w:t>
+        <w:t xml:space="preserve">3.2 </w:t>
+      </w:r>
+      <w:r>
+        <w:rPr>
+          <w:rFonts w:ascii="Times New Roman" w:hAnsi="Times New Roman" w:cs="Times New Roman"/>
+          <w:sz w:val="22"/>
+          <w:szCs w:val="22"/>
+        </w:rPr>
+        <w:t xml:space="preserve">Class </w:t>
+      </w:r>
+      <w:r>
+        <w:rPr>
+          <w:rFonts w:ascii="Times New Roman" w:hAnsi="Times New Roman" w:cs="Times New Roman"/>
+          <w:sz w:val="22"/>
+          <w:szCs w:val="22"/>
+        </w:rPr>
+        <w:t>D</w:t>
+      </w:r>
+      <w:r>
+        <w:rPr>
+          <w:rFonts w:ascii="Times New Roman" w:hAnsi="Times New Roman" w:cs="Times New Roman"/>
+          <w:sz w:val="22"/>
+          <w:szCs w:val="22"/>
+        </w:rPr>
+        <w:t>iagram</w:t>
       </w:r>
     </w:p>
     <w:p>
@@ -361,6 +377,7 @@
           <w:rFonts w:ascii="Times New Roman" w:hAnsi="Times New Roman" w:cs="Times New Roman"/>
           <w:sz w:val="22"/>
           <w:szCs w:val="22"/>
+          <w:lang w:val="en-US"/>
         </w:rPr>
       </w:pPr>
     </w:p>
@@ -371,77 +388,40 @@
           <w:rFonts w:ascii="Times New Roman" w:hAnsi="Times New Roman" w:cs="Times New Roman"/>
           <w:sz w:val="22"/>
           <w:szCs w:val="22"/>
-        </w:rPr>
-      </w:pPr>
-      <w:r>
-        <w:rPr>
-          <w:rFonts w:ascii="Times New Roman" w:hAnsi="Times New Roman" w:cs="Times New Roman"/>
-          <w:sz w:val="22"/>
-          <w:szCs w:val="22"/>
-        </w:rPr>
-        <w:t xml:space="preserve">3.2 Class </w:t>
-      </w:r>
-      <w:r>
-        <w:rPr>
-          <w:rFonts w:ascii="Times New Roman" w:hAnsi="Times New Roman" w:cs="Times New Roman"/>
-          <w:sz w:val="22"/>
-          <w:szCs w:val="22"/>
-        </w:rPr>
-        <w:t>D</w:t>
-      </w:r>
-      <w:r>
-        <w:rPr>
-          <w:rFonts w:ascii="Times New Roman" w:hAnsi="Times New Roman" w:cs="Times New Roman"/>
-          <w:sz w:val="22"/>
-          <w:szCs w:val="22"/>
-        </w:rPr>
-        <w:t>iagram</w:t>
+          <w:lang w:val="en-US"/>
+        </w:rPr>
+      </w:pPr>
+      <w:r>
+        <w:rPr>
+          <w:rFonts w:ascii="Times New Roman" w:hAnsi="Times New Roman" w:cs="Times New Roman" w:hint="eastAsia"/>
+          <w:sz w:val="22"/>
+          <w:szCs w:val="22"/>
+          <w:lang w:val="en-US"/>
+        </w:rPr>
+        <w:lastRenderedPageBreak/>
+        <w:t xml:space="preserve">3.2.1 </w:t>
+      </w:r>
+      <w:r>
+        <w:rPr>
+          <w:rFonts w:ascii="Times New Roman" w:hAnsi="Times New Roman" w:cs="Times New Roman"/>
+          <w:sz w:val="22"/>
+          <w:szCs w:val="22"/>
+          <w:lang w:val="en-US"/>
+        </w:rPr>
+        <w:t xml:space="preserve">Backend Domain &amp; Services </w:t>
       </w:r>
     </w:p>
     <w:p>
       <w:pPr>
-        <w:spacing w:line="240" w:lineRule="auto"/>
-        <w:rPr>
-          <w:rFonts w:ascii="Times New Roman" w:hAnsi="Times New Roman" w:cs="Times New Roman"/>
-          <w:sz w:val="22"/>
-          <w:szCs w:val="22"/>
-          <w:lang w:val="en-US"/>
-        </w:rPr>
-      </w:pPr>
-    </w:p>
-    <w:p>
-      <w:pPr>
-        <w:spacing w:line="240" w:lineRule="auto"/>
-        <w:rPr>
-          <w:rFonts w:ascii="Times New Roman" w:hAnsi="Times New Roman" w:cs="Times New Roman"/>
-          <w:sz w:val="22"/>
-          <w:szCs w:val="22"/>
-          <w:lang w:val="en-US"/>
-        </w:rPr>
-      </w:pPr>
-      <w:r>
-        <w:rPr>
-          <w:rFonts w:ascii="Times New Roman" w:hAnsi="Times New Roman" w:cs="Times New Roman"/>
-          <w:sz w:val="22"/>
-          <w:szCs w:val="22"/>
-          <w:lang w:val="en-US"/>
-        </w:rPr>
-        <w:lastRenderedPageBreak/>
-        <w:t xml:space="preserve">3.2.1 Backend Domain &amp; Services </w:t>
-      </w:r>
-    </w:p>
-    <w:p>
-      <w:pPr>
         <w:keepNext/>
         <w:spacing w:line="240" w:lineRule="auto"/>
         <w:rPr>
-          <w:rFonts w:ascii="Times New Roman" w:hAnsi="Times New Roman" w:cs="Times New Roman"/>
-          <w:lang w:val="en-US"/>
-        </w:rPr>
-      </w:pPr>
-      <w:r>
-        <w:rPr>
-          <w:rFonts w:ascii="Times New Roman" w:hAnsi="Times New Roman" w:cs="Times New Roman"/>
+          <w:lang w:val="en-US"/>
+        </w:rPr>
+      </w:pPr>
+      <w:r>
+        <w:rPr>
+          <w:rFonts w:hint="eastAsia"/>
           <w:noProof/>
           <w:lang w:val="en-US"/>
         </w:rPr>
@@ -488,79 +468,36 @@
         <w:jc w:val="center"/>
         <w:rPr>
           <w:rFonts w:ascii="Times New Roman" w:hAnsi="Times New Roman" w:cs="Times New Roman"/>
-          <w:sz w:val="16"/>
-          <w:szCs w:val="16"/>
-        </w:rPr>
-      </w:pPr>
-      <w:r>
-        <w:rPr>
-          <w:rFonts w:ascii="Times New Roman" w:hAnsi="Times New Roman" w:cs="Times New Roman"/>
-          <w:sz w:val="16"/>
-          <w:szCs w:val="16"/>
-        </w:rPr>
+          <w:sz w:val="22"/>
+          <w:szCs w:val="22"/>
+        </w:rPr>
+      </w:pPr>
+      <w:r>
         <w:t>Figure 3.</w:t>
       </w:r>
-      <w:r>
-        <w:rPr>
-          <w:rFonts w:ascii="Times New Roman" w:hAnsi="Times New Roman" w:cs="Times New Roman"/>
-          <w:sz w:val="16"/>
-          <w:szCs w:val="16"/>
-        </w:rPr>
-        <w:fldChar w:fldCharType="begin"/>
-      </w:r>
-      <w:r>
-        <w:rPr>
-          <w:rFonts w:ascii="Times New Roman" w:hAnsi="Times New Roman" w:cs="Times New Roman"/>
-          <w:sz w:val="16"/>
-          <w:szCs w:val="16"/>
-        </w:rPr>
-        <w:instrText xml:space="preserve"> SEQ Figure \* ARABIC </w:instrText>
-      </w:r>
-      <w:r>
-        <w:rPr>
-          <w:rFonts w:ascii="Times New Roman" w:hAnsi="Times New Roman" w:cs="Times New Roman"/>
-          <w:sz w:val="16"/>
-          <w:szCs w:val="16"/>
-        </w:rPr>
-        <w:fldChar w:fldCharType="separate"/>
-      </w:r>
-      <w:r>
-        <w:rPr>
-          <w:rFonts w:ascii="Times New Roman" w:hAnsi="Times New Roman" w:cs="Times New Roman"/>
-          <w:sz w:val="16"/>
-          <w:szCs w:val="16"/>
-        </w:rPr>
-        <w:t>2</w:t>
-      </w:r>
-      <w:r>
-        <w:rPr>
-          <w:rFonts w:ascii="Times New Roman" w:hAnsi="Times New Roman" w:cs="Times New Roman"/>
-          <w:sz w:val="16"/>
-          <w:szCs w:val="16"/>
-        </w:rPr>
-        <w:fldChar w:fldCharType="end"/>
-      </w:r>
-      <w:r>
-        <w:rPr>
-          <w:rFonts w:ascii="Times New Roman" w:hAnsi="Times New Roman" w:cs="Times New Roman"/>
-          <w:sz w:val="16"/>
-          <w:szCs w:val="16"/>
+      <w:fldSimple w:instr=" SEQ Figure \* ARABIC ">
+        <w:r>
+          <w:rPr>
+            <w:noProof/>
+          </w:rPr>
+          <w:t>2</w:t>
+        </w:r>
+      </w:fldSimple>
+      <w:r>
+        <w:rPr>
+          <w:rFonts w:hint="eastAsia"/>
         </w:rPr>
         <w:t xml:space="preserve"> </w:t>
       </w:r>
       <w:r>
         <w:rPr>
-          <w:rFonts w:ascii="Times New Roman" w:hAnsi="Times New Roman" w:cs="Times New Roman"/>
-          <w:sz w:val="16"/>
-          <w:szCs w:val="16"/>
+          <w:lang w:val="en-US"/>
         </w:rPr>
         <w:t>Backend</w:t>
       </w:r>
       <w:r>
         <w:rPr>
-          <w:rFonts w:ascii="Times New Roman" w:hAnsi="Times New Roman" w:cs="Times New Roman"/>
-          <w:sz w:val="16"/>
-          <w:szCs w:val="16"/>
+          <w:lang w:val="en-US"/>
         </w:rPr>
         <w:t xml:space="preserve"> Class Diagram</w:t>
       </w:r>
@@ -593,7 +530,16 @@
           <w:szCs w:val="22"/>
           <w:lang w:val="en-US"/>
         </w:rPr>
-        <w:t xml:space="preserve">The backend class diagram </w:t>
+        <w:t>The backend class diagram</w:t>
+      </w:r>
+      <w:r>
+        <w:rPr>
+          <w:rFonts w:ascii="Times New Roman" w:hAnsi="Times New Roman" w:cs="Times New Roman" w:hint="eastAsia"/>
+          <w:sz w:val="22"/>
+          <w:szCs w:val="22"/>
+          <w:lang w:val="en-US"/>
+        </w:rPr>
+        <w:t xml:space="preserve"> </w:t>
       </w:r>
       <w:r>
         <w:rPr>
@@ -606,12 +552,21 @@
       </w:r>
       <w:r>
         <w:rPr>
-          <w:rFonts w:ascii="Times New Roman" w:hAnsi="Times New Roman" w:cs="Times New Roman"/>
-          <w:sz w:val="22"/>
-          <w:szCs w:val="22"/>
-          <w:lang w:val="en-US"/>
-        </w:rPr>
-        <w:t>Figure 3.2</w:t>
+          <w:rFonts w:ascii="Times New Roman" w:hAnsi="Times New Roman" w:cs="Times New Roman" w:hint="eastAsia"/>
+          <w:sz w:val="22"/>
+          <w:szCs w:val="22"/>
+          <w:lang w:val="en-US"/>
+        </w:rPr>
+        <w:t>F</w:t>
+      </w:r>
+      <w:r>
+        <w:rPr>
+          <w:rFonts w:ascii="Times New Roman" w:hAnsi="Times New Roman" w:cs="Times New Roman"/>
+          <w:sz w:val="22"/>
+          <w:szCs w:val="22"/>
+          <w:lang w:val="en-US"/>
+        </w:rPr>
+        <w:t>igure 3.2</w:t>
       </w:r>
       <w:r>
         <w:rPr>
@@ -624,12 +579,21 @@
       </w:r>
       <w:r>
         <w:rPr>
-          <w:rFonts w:ascii="Times New Roman" w:hAnsi="Times New Roman" w:cs="Times New Roman"/>
-          <w:sz w:val="22"/>
-          <w:szCs w:val="22"/>
-          <w:lang w:val="en-US"/>
-        </w:rPr>
-        <w:t xml:space="preserve"> provides a deep architectural view of our core Python layer, explicitly distinguishing between Domain Entities and internal software Service classes. This duality is fundamental to expressing the core business logic of the system.</w:t>
+          <w:rFonts w:ascii="Times New Roman" w:hAnsi="Times New Roman" w:cs="Times New Roman" w:hint="eastAsia"/>
+          <w:sz w:val="22"/>
+          <w:szCs w:val="22"/>
+          <w:lang w:val="en-US"/>
+        </w:rPr>
+        <w:t xml:space="preserve"> </w:t>
+      </w:r>
+      <w:r>
+        <w:rPr>
+          <w:rFonts w:ascii="Times New Roman" w:hAnsi="Times New Roman" w:cs="Times New Roman"/>
+          <w:sz w:val="22"/>
+          <w:szCs w:val="22"/>
+          <w:lang w:val="en-US"/>
+        </w:rPr>
+        <w:t>provides a deep architectural view of our core Python layer, explicitly distinguishing between Domain Entities and internal software Service classes. This duality is fundamental to expressing the core business logic of the system.</w:t>
       </w:r>
     </w:p>
     <w:p>
@@ -649,7 +613,313 @@
           <w:szCs w:val="22"/>
           <w:lang w:val="en-US"/>
         </w:rPr>
-        <w:t>The Domain Entities (such as “Station”, “Availability”, and “User”) are designed to capture the central concepts within our problem domain. We utilize strict structural associations, depicted by solid lines, to define the long-term, static relationships between these objects. For instance, the relationship between a “User” and a “Session” is modeled as a composition. It semantically dictates that a session structurally belongs to a specific user, and its lifecycle is rigidly constrained by the user's existence. Conversely, the relationship between a “Station” and its “Availability” records is modeled as an aggregation. This signifies a "part-whole" dynamic where physical stations and their highly volatile, real-time availability metrics are inherently connected, yet a station entity logically retains its independence regardless of specific, transient availability records.</w:t>
+        <w:t xml:space="preserve">The Domain Entities (such as </w:t>
+      </w:r>
+      <w:r>
+        <w:rPr>
+          <w:rFonts w:ascii="Times New Roman" w:hAnsi="Times New Roman" w:cs="Times New Roman"/>
+          <w:sz w:val="22"/>
+          <w:szCs w:val="22"/>
+          <w:lang w:val="en-US"/>
+        </w:rPr>
+        <w:t>“</w:t>
+      </w:r>
+      <w:r>
+        <w:rPr>
+          <w:rFonts w:ascii="Times New Roman" w:hAnsi="Times New Roman" w:cs="Times New Roman"/>
+          <w:sz w:val="22"/>
+          <w:szCs w:val="22"/>
+          <w:lang w:val="en-US"/>
+        </w:rPr>
+        <w:t>Station</w:t>
+      </w:r>
+      <w:r>
+        <w:rPr>
+          <w:rFonts w:ascii="Times New Roman" w:hAnsi="Times New Roman" w:cs="Times New Roman"/>
+          <w:sz w:val="22"/>
+          <w:szCs w:val="22"/>
+          <w:lang w:val="en-US"/>
+        </w:rPr>
+        <w:t>”</w:t>
+      </w:r>
+      <w:r>
+        <w:rPr>
+          <w:rFonts w:ascii="Times New Roman" w:hAnsi="Times New Roman" w:cs="Times New Roman"/>
+          <w:sz w:val="22"/>
+          <w:szCs w:val="22"/>
+          <w:lang w:val="en-US"/>
+        </w:rPr>
+        <w:t xml:space="preserve">, </w:t>
+      </w:r>
+      <w:r>
+        <w:rPr>
+          <w:rFonts w:ascii="Times New Roman" w:hAnsi="Times New Roman" w:cs="Times New Roman"/>
+          <w:sz w:val="22"/>
+          <w:szCs w:val="22"/>
+          <w:lang w:val="en-US"/>
+        </w:rPr>
+        <w:t>“</w:t>
+      </w:r>
+      <w:r>
+        <w:rPr>
+          <w:rFonts w:ascii="Times New Roman" w:hAnsi="Times New Roman" w:cs="Times New Roman"/>
+          <w:sz w:val="22"/>
+          <w:szCs w:val="22"/>
+          <w:lang w:val="en-US"/>
+        </w:rPr>
+        <w:t>Availability</w:t>
+      </w:r>
+      <w:r>
+        <w:rPr>
+          <w:rFonts w:ascii="Times New Roman" w:hAnsi="Times New Roman" w:cs="Times New Roman"/>
+          <w:sz w:val="22"/>
+          <w:szCs w:val="22"/>
+          <w:lang w:val="en-US"/>
+        </w:rPr>
+        <w:t>”</w:t>
+      </w:r>
+      <w:r>
+        <w:rPr>
+          <w:rFonts w:ascii="Times New Roman" w:hAnsi="Times New Roman" w:cs="Times New Roman"/>
+          <w:sz w:val="22"/>
+          <w:szCs w:val="22"/>
+          <w:lang w:val="en-US"/>
+        </w:rPr>
+        <w:t xml:space="preserve">, and </w:t>
+      </w:r>
+      <w:r>
+        <w:rPr>
+          <w:rFonts w:ascii="Times New Roman" w:hAnsi="Times New Roman" w:cs="Times New Roman"/>
+          <w:sz w:val="22"/>
+          <w:szCs w:val="22"/>
+          <w:lang w:val="en-US"/>
+        </w:rPr>
+        <w:t>“</w:t>
+      </w:r>
+      <w:r>
+        <w:rPr>
+          <w:rFonts w:ascii="Times New Roman" w:hAnsi="Times New Roman" w:cs="Times New Roman"/>
+          <w:sz w:val="22"/>
+          <w:szCs w:val="22"/>
+          <w:lang w:val="en-US"/>
+        </w:rPr>
+        <w:t>User</w:t>
+      </w:r>
+      <w:r>
+        <w:rPr>
+          <w:rFonts w:ascii="Times New Roman" w:hAnsi="Times New Roman" w:cs="Times New Roman"/>
+          <w:sz w:val="22"/>
+          <w:szCs w:val="22"/>
+          <w:lang w:val="en-US"/>
+        </w:rPr>
+        <w:t>”</w:t>
+      </w:r>
+      <w:r>
+        <w:rPr>
+          <w:rFonts w:ascii="Times New Roman" w:hAnsi="Times New Roman" w:cs="Times New Roman"/>
+          <w:sz w:val="22"/>
+          <w:szCs w:val="22"/>
+          <w:lang w:val="en-US"/>
+        </w:rPr>
+        <w:t xml:space="preserve">) are designed to capture the central concepts within our problem domain. We utilize strict structural associations, depicted by solid lines, to define the long-term, static relationships between these objects. For instance, the relationship between a </w:t>
+      </w:r>
+      <w:r>
+        <w:rPr>
+          <w:rFonts w:ascii="Times New Roman" w:hAnsi="Times New Roman" w:cs="Times New Roman"/>
+          <w:sz w:val="22"/>
+          <w:szCs w:val="22"/>
+          <w:lang w:val="en-US"/>
+        </w:rPr>
+        <w:t>“</w:t>
+      </w:r>
+      <w:r>
+        <w:rPr>
+          <w:rFonts w:ascii="Times New Roman" w:hAnsi="Times New Roman" w:cs="Times New Roman"/>
+          <w:sz w:val="22"/>
+          <w:szCs w:val="22"/>
+          <w:lang w:val="en-US"/>
+        </w:rPr>
+        <w:t>User</w:t>
+      </w:r>
+      <w:r>
+        <w:rPr>
+          <w:rFonts w:ascii="Times New Roman" w:hAnsi="Times New Roman" w:cs="Times New Roman"/>
+          <w:sz w:val="22"/>
+          <w:szCs w:val="22"/>
+          <w:lang w:val="en-US"/>
+        </w:rPr>
+        <w:t>”</w:t>
+      </w:r>
+      <w:r>
+        <w:rPr>
+          <w:rFonts w:ascii="Times New Roman" w:hAnsi="Times New Roman" w:cs="Times New Roman"/>
+          <w:sz w:val="22"/>
+          <w:szCs w:val="22"/>
+          <w:lang w:val="en-US"/>
+        </w:rPr>
+        <w:t xml:space="preserve"> and a </w:t>
+      </w:r>
+      <w:r>
+        <w:rPr>
+          <w:rFonts w:ascii="Times New Roman" w:hAnsi="Times New Roman" w:cs="Times New Roman"/>
+          <w:sz w:val="22"/>
+          <w:szCs w:val="22"/>
+          <w:lang w:val="en-US"/>
+        </w:rPr>
+        <w:t>“</w:t>
+      </w:r>
+      <w:r>
+        <w:rPr>
+          <w:rFonts w:ascii="Times New Roman" w:hAnsi="Times New Roman" w:cs="Times New Roman"/>
+          <w:sz w:val="22"/>
+          <w:szCs w:val="22"/>
+          <w:lang w:val="en-US"/>
+        </w:rPr>
+        <w:t>Session</w:t>
+      </w:r>
+      <w:r>
+        <w:rPr>
+          <w:rFonts w:ascii="Times New Roman" w:hAnsi="Times New Roman" w:cs="Times New Roman"/>
+          <w:sz w:val="22"/>
+          <w:szCs w:val="22"/>
+          <w:lang w:val="en-US"/>
+        </w:rPr>
+        <w:t>”</w:t>
+      </w:r>
+      <w:r>
+        <w:rPr>
+          <w:rFonts w:ascii="Times New Roman" w:hAnsi="Times New Roman" w:cs="Times New Roman"/>
+          <w:sz w:val="22"/>
+          <w:szCs w:val="22"/>
+          <w:lang w:val="en-US"/>
+        </w:rPr>
+        <w:t xml:space="preserve"> is modeled as a </w:t>
+      </w:r>
+      <w:r>
+        <w:rPr>
+          <w:rFonts w:ascii="Times New Roman" w:hAnsi="Times New Roman" w:cs="Times New Roman"/>
+          <w:sz w:val="22"/>
+          <w:szCs w:val="22"/>
+          <w:lang w:val="en-US"/>
+        </w:rPr>
+        <w:t>c</w:t>
+      </w:r>
+      <w:r>
+        <w:rPr>
+          <w:rFonts w:ascii="Times New Roman" w:hAnsi="Times New Roman" w:cs="Times New Roman"/>
+          <w:sz w:val="22"/>
+          <w:szCs w:val="22"/>
+          <w:lang w:val="en-US"/>
+        </w:rPr>
+        <w:t xml:space="preserve">omposition. </w:t>
+      </w:r>
+      <w:r>
+        <w:rPr>
+          <w:rFonts w:ascii="Times New Roman" w:hAnsi="Times New Roman" w:cs="Times New Roman"/>
+          <w:sz w:val="22"/>
+          <w:szCs w:val="22"/>
+          <w:lang w:val="en-US"/>
+        </w:rPr>
+        <w:t>I</w:t>
+      </w:r>
+      <w:r>
+        <w:rPr>
+          <w:rFonts w:ascii="Times New Roman" w:hAnsi="Times New Roman" w:cs="Times New Roman"/>
+          <w:sz w:val="22"/>
+          <w:szCs w:val="22"/>
+          <w:lang w:val="en-US"/>
+        </w:rPr>
+        <w:t xml:space="preserve">t semantically dictates that a session structurally belongs to a specific user, and its lifecycle is rigidly constrained by the user's existence. Conversely, the relationship between a </w:t>
+      </w:r>
+      <w:r>
+        <w:rPr>
+          <w:rFonts w:ascii="Times New Roman" w:hAnsi="Times New Roman" w:cs="Times New Roman"/>
+          <w:sz w:val="22"/>
+          <w:szCs w:val="22"/>
+          <w:lang w:val="en-US"/>
+        </w:rPr>
+        <w:t>“</w:t>
+      </w:r>
+      <w:r>
+        <w:rPr>
+          <w:rFonts w:ascii="Times New Roman" w:hAnsi="Times New Roman" w:cs="Times New Roman"/>
+          <w:sz w:val="22"/>
+          <w:szCs w:val="22"/>
+          <w:lang w:val="en-US"/>
+        </w:rPr>
+        <w:t>Station</w:t>
+      </w:r>
+      <w:r>
+        <w:rPr>
+          <w:rFonts w:ascii="Times New Roman" w:hAnsi="Times New Roman" w:cs="Times New Roman"/>
+          <w:sz w:val="22"/>
+          <w:szCs w:val="22"/>
+          <w:lang w:val="en-US"/>
+        </w:rPr>
+        <w:t>”</w:t>
+      </w:r>
+      <w:r>
+        <w:rPr>
+          <w:rFonts w:ascii="Times New Roman" w:hAnsi="Times New Roman" w:cs="Times New Roman"/>
+          <w:sz w:val="22"/>
+          <w:szCs w:val="22"/>
+          <w:lang w:val="en-US"/>
+        </w:rPr>
+        <w:t xml:space="preserve"> and its </w:t>
+      </w:r>
+      <w:r>
+        <w:rPr>
+          <w:rFonts w:ascii="Times New Roman" w:hAnsi="Times New Roman" w:cs="Times New Roman"/>
+          <w:sz w:val="22"/>
+          <w:szCs w:val="22"/>
+          <w:lang w:val="en-US"/>
+        </w:rPr>
+        <w:t>“</w:t>
+      </w:r>
+      <w:r>
+        <w:rPr>
+          <w:rFonts w:ascii="Times New Roman" w:hAnsi="Times New Roman" w:cs="Times New Roman"/>
+          <w:sz w:val="22"/>
+          <w:szCs w:val="22"/>
+          <w:lang w:val="en-US"/>
+        </w:rPr>
+        <w:t>Availability</w:t>
+      </w:r>
+      <w:r>
+        <w:rPr>
+          <w:rFonts w:ascii="Times New Roman" w:hAnsi="Times New Roman" w:cs="Times New Roman"/>
+          <w:sz w:val="22"/>
+          <w:szCs w:val="22"/>
+          <w:lang w:val="en-US"/>
+        </w:rPr>
+        <w:t>”</w:t>
+      </w:r>
+      <w:r>
+        <w:rPr>
+          <w:rFonts w:ascii="Times New Roman" w:hAnsi="Times New Roman" w:cs="Times New Roman"/>
+          <w:sz w:val="22"/>
+          <w:szCs w:val="22"/>
+          <w:lang w:val="en-US"/>
+        </w:rPr>
+        <w:t xml:space="preserve"> records is modeled as an </w:t>
+      </w:r>
+      <w:r>
+        <w:rPr>
+          <w:rFonts w:ascii="Times New Roman" w:hAnsi="Times New Roman" w:cs="Times New Roman"/>
+          <w:sz w:val="22"/>
+          <w:szCs w:val="22"/>
+          <w:lang w:val="en-US"/>
+        </w:rPr>
+        <w:t>a</w:t>
+      </w:r>
+      <w:r>
+        <w:rPr>
+          <w:rFonts w:ascii="Times New Roman" w:hAnsi="Times New Roman" w:cs="Times New Roman"/>
+          <w:sz w:val="22"/>
+          <w:szCs w:val="22"/>
+          <w:lang w:val="en-US"/>
+        </w:rPr>
+        <w:t>ggregation. This signifies a "part-whole" dynamic where physical stations and their highly volatile, real-time availability metrics are inherently connected, yet a station entity logically retains its independence regardless of specific, transient availability records.</w:t>
       </w:r>
     </w:p>
     <w:p>
@@ -669,9 +939,53 @@
           <w:szCs w:val="22"/>
           <w:lang w:val="en-US"/>
         </w:rPr>
-        <w:t>Operating above these entities is the service layer. Service classes (such as “</w:t>
-      </w:r>
-      <w:proofErr w:type="spellStart"/>
+        <w:t xml:space="preserve">Operating above these entities is the </w:t>
+      </w:r>
+      <w:r>
+        <w:rPr>
+          <w:rFonts w:ascii="Times New Roman" w:hAnsi="Times New Roman" w:cs="Times New Roman"/>
+          <w:sz w:val="22"/>
+          <w:szCs w:val="22"/>
+          <w:lang w:val="en-US"/>
+        </w:rPr>
+        <w:t>s</w:t>
+      </w:r>
+      <w:r>
+        <w:rPr>
+          <w:rFonts w:ascii="Times New Roman" w:hAnsi="Times New Roman" w:cs="Times New Roman"/>
+          <w:sz w:val="22"/>
+          <w:szCs w:val="22"/>
+          <w:lang w:val="en-US"/>
+        </w:rPr>
+        <w:t xml:space="preserve">ervice </w:t>
+      </w:r>
+      <w:r>
+        <w:rPr>
+          <w:rFonts w:ascii="Times New Roman" w:hAnsi="Times New Roman" w:cs="Times New Roman"/>
+          <w:sz w:val="22"/>
+          <w:szCs w:val="22"/>
+          <w:lang w:val="en-US"/>
+        </w:rPr>
+        <w:t>l</w:t>
+      </w:r>
+      <w:r>
+        <w:rPr>
+          <w:rFonts w:ascii="Times New Roman" w:hAnsi="Times New Roman" w:cs="Times New Roman"/>
+          <w:sz w:val="22"/>
+          <w:szCs w:val="22"/>
+          <w:lang w:val="en-US"/>
+        </w:rPr>
+        <w:t xml:space="preserve">ayer. Service classes (such as </w:t>
+      </w:r>
+      <w:r>
+        <w:rPr>
+          <w:rFonts w:ascii="Times New Roman" w:hAnsi="Times New Roman" w:cs="Times New Roman"/>
+          <w:sz w:val="22"/>
+          <w:szCs w:val="22"/>
+          <w:lang w:val="en-US"/>
+        </w:rPr>
+        <w:t>“</w:t>
+      </w:r>
       <w:r>
         <w:rPr>
           <w:rFonts w:ascii="Times New Roman" w:hAnsi="Times New Roman" w:cs="Times New Roman"/>
@@ -681,17 +995,33 @@
         </w:rPr>
         <w:t>JourneyService</w:t>
       </w:r>
-      <w:proofErr w:type="spellEnd"/>
-      <w:r>
-        <w:rPr>
-          <w:rFonts w:ascii="Times New Roman" w:hAnsi="Times New Roman" w:cs="Times New Roman"/>
-          <w:sz w:val="22"/>
-          <w:szCs w:val="22"/>
-          <w:lang w:val="en-US"/>
-        </w:rPr>
-        <w:t>” and “</w:t>
-      </w:r>
-      <w:proofErr w:type="spellStart"/>
+      <w:r>
+        <w:rPr>
+          <w:rFonts w:ascii="Times New Roman" w:hAnsi="Times New Roman" w:cs="Times New Roman"/>
+          <w:sz w:val="22"/>
+          <w:szCs w:val="22"/>
+          <w:lang w:val="en-US"/>
+        </w:rPr>
+        <w:t>”</w:t>
+      </w:r>
+      <w:r>
+        <w:rPr>
+          <w:rFonts w:ascii="Times New Roman" w:hAnsi="Times New Roman" w:cs="Times New Roman"/>
+          <w:sz w:val="22"/>
+          <w:szCs w:val="22"/>
+          <w:lang w:val="en-US"/>
+        </w:rPr>
+        <w:t xml:space="preserve"> and </w:t>
+      </w:r>
+      <w:r>
+        <w:rPr>
+          <w:rFonts w:ascii="Times New Roman" w:hAnsi="Times New Roman" w:cs="Times New Roman"/>
+          <w:sz w:val="22"/>
+          <w:szCs w:val="22"/>
+          <w:lang w:val="en-US"/>
+        </w:rPr>
+        <w:t>“</w:t>
+      </w:r>
       <w:r>
         <w:rPr>
           <w:rFonts w:ascii="Times New Roman" w:hAnsi="Times New Roman" w:cs="Times New Roman"/>
@@ -701,15 +1031,77 @@
         </w:rPr>
         <w:t>StationService</w:t>
       </w:r>
-      <w:proofErr w:type="spellEnd"/>
-      <w:r>
-        <w:rPr>
-          <w:rFonts w:ascii="Times New Roman" w:hAnsi="Times New Roman" w:cs="Times New Roman"/>
-          <w:sz w:val="22"/>
-          <w:szCs w:val="22"/>
-          <w:lang w:val="en-US"/>
-        </w:rPr>
-        <w:t>”) reside purely within the software. Their primary responsibility is to orchestrate complex behaviors and algorithms that do not naturally belong to any single domain entity. To model the interactions within this layer, we made a deliberate design decision to extensively employ use dependencies.</w:t>
+      <w:r>
+        <w:rPr>
+          <w:rFonts w:ascii="Times New Roman" w:hAnsi="Times New Roman" w:cs="Times New Roman"/>
+          <w:sz w:val="22"/>
+          <w:szCs w:val="22"/>
+          <w:lang w:val="en-US"/>
+        </w:rPr>
+        <w:t>”</w:t>
+      </w:r>
+      <w:r>
+        <w:rPr>
+          <w:rFonts w:ascii="Times New Roman" w:hAnsi="Times New Roman" w:cs="Times New Roman"/>
+          <w:sz w:val="22"/>
+          <w:szCs w:val="22"/>
+          <w:lang w:val="en-US"/>
+        </w:rPr>
+        <w:t>) reside purely within the software</w:t>
+      </w:r>
+      <w:r>
+        <w:rPr>
+          <w:rFonts w:ascii="Times New Roman" w:hAnsi="Times New Roman" w:cs="Times New Roman"/>
+          <w:sz w:val="22"/>
+          <w:szCs w:val="22"/>
+          <w:lang w:val="en-US"/>
+        </w:rPr>
+        <w:t xml:space="preserve">. </w:t>
+      </w:r>
+      <w:r>
+        <w:rPr>
+          <w:rFonts w:ascii="Times New Roman" w:hAnsi="Times New Roman" w:cs="Times New Roman"/>
+          <w:sz w:val="22"/>
+          <w:szCs w:val="22"/>
+          <w:lang w:val="en-US"/>
+        </w:rPr>
+        <w:t xml:space="preserve">Their primary responsibility is to orchestrate complex behaviors and algorithms that do not naturally belong to any single domain entity. To model the interactions within this layer, we made a deliberate design decision to extensively employ </w:t>
+      </w:r>
+      <w:r>
+        <w:rPr>
+          <w:rFonts w:ascii="Times New Roman" w:hAnsi="Times New Roman" w:cs="Times New Roman"/>
+          <w:sz w:val="22"/>
+          <w:szCs w:val="22"/>
+          <w:lang w:val="en-US"/>
+        </w:rPr>
+        <w:t>u</w:t>
+      </w:r>
+      <w:r>
+        <w:rPr>
+          <w:rFonts w:ascii="Times New Roman" w:hAnsi="Times New Roman" w:cs="Times New Roman"/>
+          <w:sz w:val="22"/>
+          <w:szCs w:val="22"/>
+          <w:lang w:val="en-US"/>
+        </w:rPr>
+        <w:t xml:space="preserve">se </w:t>
+      </w:r>
+      <w:r>
+        <w:rPr>
+          <w:rFonts w:ascii="Times New Roman" w:hAnsi="Times New Roman" w:cs="Times New Roman"/>
+          <w:sz w:val="22"/>
+          <w:szCs w:val="22"/>
+          <w:lang w:val="en-US"/>
+        </w:rPr>
+        <w:t>d</w:t>
+      </w:r>
+      <w:r>
+        <w:rPr>
+          <w:rFonts w:ascii="Times New Roman" w:hAnsi="Times New Roman" w:cs="Times New Roman"/>
+          <w:sz w:val="22"/>
+          <w:szCs w:val="22"/>
+          <w:lang w:val="en-US"/>
+        </w:rPr>
+        <w:t>ependencies.</w:t>
       </w:r>
     </w:p>
     <w:p>
@@ -729,9 +1121,17 @@
           <w:szCs w:val="22"/>
           <w:lang w:val="en-US"/>
         </w:rPr>
-        <w:t>This design choice is crucial for demonstrating the underlying collaborative logic of the application. Taking the “</w:t>
-      </w:r>
-      <w:proofErr w:type="spellStart"/>
+        <w:t xml:space="preserve">This design choice is crucial for demonstrating the underlying collaborative logic of the application. Taking the </w:t>
+      </w:r>
+      <w:r>
+        <w:rPr>
+          <w:rFonts w:ascii="Times New Roman" w:hAnsi="Times New Roman" w:cs="Times New Roman"/>
+          <w:sz w:val="22"/>
+          <w:szCs w:val="22"/>
+          <w:lang w:val="en-US"/>
+        </w:rPr>
+        <w:t>“</w:t>
+      </w:r>
       <w:r>
         <w:rPr>
           <w:rFonts w:ascii="Times New Roman" w:hAnsi="Times New Roman" w:cs="Times New Roman"/>
@@ -741,17 +1141,33 @@
         </w:rPr>
         <w:t>JourneyService</w:t>
       </w:r>
-      <w:proofErr w:type="spellEnd"/>
-      <w:r>
-        <w:rPr>
-          <w:rFonts w:ascii="Times New Roman" w:hAnsi="Times New Roman" w:cs="Times New Roman"/>
-          <w:sz w:val="22"/>
-          <w:szCs w:val="22"/>
-          <w:lang w:val="en-US"/>
-        </w:rPr>
-        <w:t>” as a prime example: it does not structurally own any station data. Its core mandate is to execute sophisticated pathfinding algorithms. However, to successfully complete a behavior like “</w:t>
-      </w:r>
-      <w:proofErr w:type="spellStart"/>
+      <w:r>
+        <w:rPr>
+          <w:rFonts w:ascii="Times New Roman" w:hAnsi="Times New Roman" w:cs="Times New Roman"/>
+          <w:sz w:val="22"/>
+          <w:szCs w:val="22"/>
+          <w:lang w:val="en-US"/>
+        </w:rPr>
+        <w:t>”</w:t>
+      </w:r>
+      <w:r>
+        <w:rPr>
+          <w:rFonts w:ascii="Times New Roman" w:hAnsi="Times New Roman" w:cs="Times New Roman"/>
+          <w:sz w:val="22"/>
+          <w:szCs w:val="22"/>
+          <w:lang w:val="en-US"/>
+        </w:rPr>
+        <w:t xml:space="preserve"> as a prime example: it does not structurally own any station data. Its core mandate is to execute sophisticated pathfinding algorithms. However, to successfully complete a behavior like </w:t>
+      </w:r>
+      <w:r>
+        <w:rPr>
+          <w:rFonts w:ascii="Times New Roman" w:hAnsi="Times New Roman" w:cs="Times New Roman"/>
+          <w:sz w:val="22"/>
+          <w:szCs w:val="22"/>
+          <w:lang w:val="en-US"/>
+        </w:rPr>
+        <w:t>“</w:t>
+      </w:r>
       <w:r>
         <w:rPr>
           <w:rFonts w:ascii="Times New Roman" w:hAnsi="Times New Roman" w:cs="Times New Roman"/>
@@ -769,17 +1185,7 @@
           <w:szCs w:val="22"/>
           <w:lang w:val="en-US"/>
         </w:rPr>
-        <w:t>route</w:t>
-      </w:r>
-      <w:proofErr w:type="spellEnd"/>
-      <w:r>
-        <w:rPr>
-          <w:rFonts w:ascii="Times New Roman" w:hAnsi="Times New Roman" w:cs="Times New Roman"/>
-          <w:sz w:val="22"/>
-          <w:szCs w:val="22"/>
-          <w:lang w:val="en-US"/>
-        </w:rPr>
-        <w:t>(</w:t>
+        <w:t>route(</w:t>
       </w:r>
       <w:proofErr w:type="gramEnd"/>
       <w:r>
@@ -789,9 +1195,35 @@
           <w:szCs w:val="22"/>
           <w:lang w:val="en-US"/>
         </w:rPr>
-        <w:t>)”, it must temporarily invoke the “</w:t>
-      </w:r>
-      <w:proofErr w:type="spellStart"/>
+        <w:t>)</w:t>
+      </w:r>
+      <w:r>
+        <w:rPr>
+          <w:rFonts w:ascii="Times New Roman" w:hAnsi="Times New Roman" w:cs="Times New Roman"/>
+          <w:sz w:val="22"/>
+          <w:szCs w:val="22"/>
+          <w:lang w:val="en-US"/>
+        </w:rPr>
+        <w:t>”</w:t>
+      </w:r>
+      <w:r>
+        <w:rPr>
+          <w:rFonts w:ascii="Times New Roman" w:hAnsi="Times New Roman" w:cs="Times New Roman"/>
+          <w:sz w:val="22"/>
+          <w:szCs w:val="22"/>
+          <w:lang w:val="en-US"/>
+        </w:rPr>
+        <w:t xml:space="preserve">, it must temporarily invoke the </w:t>
+      </w:r>
+      <w:r>
+        <w:rPr>
+          <w:rFonts w:ascii="Times New Roman" w:hAnsi="Times New Roman" w:cs="Times New Roman"/>
+          <w:sz w:val="22"/>
+          <w:szCs w:val="22"/>
+          <w:lang w:val="en-US"/>
+        </w:rPr>
+        <w:t>“</w:t>
+      </w:r>
       <w:r>
         <w:rPr>
           <w:rFonts w:ascii="Times New Roman" w:hAnsi="Times New Roman" w:cs="Times New Roman"/>
@@ -801,15 +1233,59 @@
         </w:rPr>
         <w:t>StationService</w:t>
       </w:r>
-      <w:proofErr w:type="spellEnd"/>
-      <w:r>
-        <w:rPr>
-          <w:rFonts w:ascii="Times New Roman" w:hAnsi="Times New Roman" w:cs="Times New Roman"/>
-          <w:sz w:val="22"/>
-          <w:szCs w:val="22"/>
-          <w:lang w:val="en-US"/>
-        </w:rPr>
-        <w:t>” to acquire the latest real-time station statuses. By mapping this as a dashed dependency rather than a solid structural association, we explicitly enforce the principle of separation of concerns. It illustrates a short-term, behavior-driven collaboration rather than structural ownership, thereby effectively minimizing tight coupling between independent software modules.</w:t>
+      <w:r>
+        <w:rPr>
+          <w:rFonts w:ascii="Times New Roman" w:hAnsi="Times New Roman" w:cs="Times New Roman"/>
+          <w:sz w:val="22"/>
+          <w:szCs w:val="22"/>
+          <w:lang w:val="en-US"/>
+        </w:rPr>
+        <w:t>”</w:t>
+      </w:r>
+      <w:r>
+        <w:rPr>
+          <w:rFonts w:ascii="Times New Roman" w:hAnsi="Times New Roman" w:cs="Times New Roman"/>
+          <w:sz w:val="22"/>
+          <w:szCs w:val="22"/>
+          <w:lang w:val="en-US"/>
+        </w:rPr>
+        <w:t xml:space="preserve"> to acquire the latest real-time station statuses. By mapping this as a dashed dependency rather than a solid structural association, we explicitly enforce the principle of </w:t>
+      </w:r>
+      <w:r>
+        <w:rPr>
+          <w:rFonts w:ascii="Times New Roman" w:hAnsi="Times New Roman" w:cs="Times New Roman"/>
+          <w:sz w:val="22"/>
+          <w:szCs w:val="22"/>
+          <w:lang w:val="en-US"/>
+        </w:rPr>
+        <w:t>s</w:t>
+      </w:r>
+      <w:r>
+        <w:rPr>
+          <w:rFonts w:ascii="Times New Roman" w:hAnsi="Times New Roman" w:cs="Times New Roman"/>
+          <w:sz w:val="22"/>
+          <w:szCs w:val="22"/>
+          <w:lang w:val="en-US"/>
+        </w:rPr>
+        <w:t xml:space="preserve">eparation of </w:t>
+      </w:r>
+      <w:r>
+        <w:rPr>
+          <w:rFonts w:ascii="Times New Roman" w:hAnsi="Times New Roman" w:cs="Times New Roman"/>
+          <w:sz w:val="22"/>
+          <w:szCs w:val="22"/>
+          <w:lang w:val="en-US"/>
+        </w:rPr>
+        <w:t>c</w:t>
+      </w:r>
+      <w:r>
+        <w:rPr>
+          <w:rFonts w:ascii="Times New Roman" w:hAnsi="Times New Roman" w:cs="Times New Roman"/>
+          <w:sz w:val="22"/>
+          <w:szCs w:val="22"/>
+          <w:lang w:val="en-US"/>
+        </w:rPr>
+        <w:t>oncerns. It illustrates a short-term, behavior-driven collaboration rather than structural ownership, thereby effectively minimizing tight coupling between independent software modules.</w:t>
       </w:r>
     </w:p>
     <w:p>
@@ -840,11 +1316,20 @@
           <w:szCs w:val="22"/>
           <w:lang w:val="en-US"/>
         </w:rPr>
-        <w:t xml:space="preserve">3.2.2 Frontend </w:t>
-      </w:r>
-      <w:r>
-        <w:rPr>
-          <w:rFonts w:ascii="Times New Roman" w:hAnsi="Times New Roman" w:cs="Times New Roman"/>
+        <w:t xml:space="preserve">3.2.2 </w:t>
+      </w:r>
+      <w:r>
+        <w:rPr>
+          <w:rFonts w:ascii="Times New Roman" w:hAnsi="Times New Roman" w:cs="Times New Roman"/>
+          <w:sz w:val="22"/>
+          <w:szCs w:val="22"/>
+          <w:lang w:val="en-US"/>
+        </w:rPr>
+        <w:t xml:space="preserve">Frontend </w:t>
+      </w:r>
+      <w:r>
+        <w:rPr>
+          <w:rFonts w:ascii="Times New Roman" w:hAnsi="Times New Roman" w:cs="Times New Roman" w:hint="eastAsia"/>
           <w:sz w:val="22"/>
           <w:szCs w:val="22"/>
           <w:lang w:val="en-US"/>
@@ -865,13 +1350,9 @@
       <w:pPr>
         <w:keepNext/>
         <w:spacing w:line="240" w:lineRule="auto"/>
-        <w:rPr>
-          <w:rFonts w:ascii="Times New Roman" w:hAnsi="Times New Roman" w:cs="Times New Roman"/>
-        </w:rPr>
-      </w:pPr>
-      <w:r>
-        <w:rPr>
-          <w:rFonts w:ascii="Times New Roman" w:hAnsi="Times New Roman" w:cs="Times New Roman"/>
+      </w:pPr>
+      <w:r>
+        <w:rPr>
           <w:noProof/>
         </w:rPr>
         <w:drawing>
@@ -917,71 +1398,43 @@
         <w:jc w:val="center"/>
         <w:rPr>
           <w:rFonts w:ascii="Times New Roman" w:hAnsi="Times New Roman" w:cs="Times New Roman"/>
-          <w:sz w:val="16"/>
-          <w:szCs w:val="16"/>
-        </w:rPr>
-      </w:pPr>
-      <w:r>
-        <w:rPr>
-          <w:rFonts w:ascii="Times New Roman" w:hAnsi="Times New Roman" w:cs="Times New Roman"/>
-          <w:sz w:val="16"/>
-          <w:szCs w:val="16"/>
-        </w:rPr>
-        <w:t>Figure 3.</w:t>
-      </w:r>
-      <w:r>
-        <w:rPr>
-          <w:rFonts w:ascii="Times New Roman" w:hAnsi="Times New Roman" w:cs="Times New Roman"/>
-          <w:sz w:val="16"/>
-          <w:szCs w:val="16"/>
-        </w:rPr>
-        <w:fldChar w:fldCharType="begin"/>
-      </w:r>
-      <w:r>
-        <w:rPr>
-          <w:rFonts w:ascii="Times New Roman" w:hAnsi="Times New Roman" w:cs="Times New Roman"/>
-          <w:sz w:val="16"/>
-          <w:szCs w:val="16"/>
-        </w:rPr>
-        <w:instrText xml:space="preserve"> SEQ Figure \* ARABIC </w:instrText>
-      </w:r>
-      <w:r>
-        <w:rPr>
-          <w:rFonts w:ascii="Times New Roman" w:hAnsi="Times New Roman" w:cs="Times New Roman"/>
-          <w:sz w:val="16"/>
-          <w:szCs w:val="16"/>
-        </w:rPr>
-        <w:fldChar w:fldCharType="separate"/>
-      </w:r>
-      <w:r>
-        <w:rPr>
-          <w:rFonts w:ascii="Times New Roman" w:hAnsi="Times New Roman" w:cs="Times New Roman"/>
-          <w:sz w:val="16"/>
-          <w:szCs w:val="16"/>
-        </w:rPr>
-        <w:t>3</w:t>
-      </w:r>
-      <w:r>
-        <w:rPr>
-          <w:rFonts w:ascii="Times New Roman" w:hAnsi="Times New Roman" w:cs="Times New Roman"/>
-          <w:sz w:val="16"/>
-          <w:szCs w:val="16"/>
-        </w:rPr>
-        <w:fldChar w:fldCharType="end"/>
-      </w:r>
-      <w:r>
-        <w:rPr>
-          <w:rFonts w:ascii="Times New Roman" w:hAnsi="Times New Roman" w:cs="Times New Roman"/>
-          <w:sz w:val="16"/>
-          <w:szCs w:val="16"/>
-        </w:rPr>
-        <w:t xml:space="preserve"> Frontend </w:t>
-      </w:r>
-      <w:r>
-        <w:rPr>
-          <w:rFonts w:ascii="Times New Roman" w:hAnsi="Times New Roman" w:cs="Times New Roman"/>
-          <w:sz w:val="16"/>
-          <w:szCs w:val="16"/>
+          <w:sz w:val="22"/>
+          <w:szCs w:val="22"/>
+          <w:lang w:val="en-US"/>
+        </w:rPr>
+      </w:pPr>
+      <w:r>
+        <w:t xml:space="preserve">Figure </w:t>
+      </w:r>
+      <w:r>
+        <w:rPr>
+          <w:rFonts w:hint="eastAsia"/>
+        </w:rPr>
+        <w:t>3.</w:t>
+      </w:r>
+      <w:fldSimple w:instr=" SEQ Figure \* ARABIC ">
+        <w:r>
+          <w:rPr>
+            <w:noProof/>
+          </w:rPr>
+          <w:t>3</w:t>
+        </w:r>
+      </w:fldSimple>
+      <w:r>
+        <w:rPr>
+          <w:rFonts w:hint="eastAsia"/>
+        </w:rPr>
+        <w:t xml:space="preserve"> Frontend</w:t>
+      </w:r>
+      <w:r>
+        <w:rPr>
+          <w:lang w:val="en-US"/>
+        </w:rPr>
+        <w:t xml:space="preserve"> </w:t>
+      </w:r>
+      <w:r>
+        <w:rPr>
+          <w:lang w:val="en-US"/>
         </w:rPr>
         <w:t>Class Diagram</w:t>
       </w:r>
@@ -1021,16 +1474,97 @@
           <w:szCs w:val="22"/>
           <w:lang w:val="en-US"/>
         </w:rPr>
-        <w:t xml:space="preserve"> the frontend as an ambiguous monolith, each core page (such as “Maps” or “Chat”) is represented as an isolated, self-contained </w:t>
-      </w:r>
-      <w:r>
-        <w:rPr>
-          <w:rFonts w:ascii="Times New Roman" w:hAnsi="Times New Roman" w:cs="Times New Roman"/>
-          <w:sz w:val="22"/>
-          <w:szCs w:val="22"/>
-          <w:lang w:val="en-US"/>
-        </w:rPr>
-        <w:t>functional component</w:t>
+        <w:t xml:space="preserve"> the frontend as an ambiguous monolith, each core page (such as </w:t>
+      </w:r>
+      <w:r>
+        <w:rPr>
+          <w:rFonts w:ascii="Times New Roman" w:hAnsi="Times New Roman" w:cs="Times New Roman"/>
+          <w:sz w:val="22"/>
+          <w:szCs w:val="22"/>
+          <w:lang w:val="en-US"/>
+        </w:rPr>
+        <w:t>“</w:t>
+      </w:r>
+      <w:r>
+        <w:rPr>
+          <w:rFonts w:ascii="Times New Roman" w:hAnsi="Times New Roman" w:cs="Times New Roman"/>
+          <w:sz w:val="22"/>
+          <w:szCs w:val="22"/>
+          <w:lang w:val="en-US"/>
+        </w:rPr>
+        <w:t>Maps</w:t>
+      </w:r>
+      <w:r>
+        <w:rPr>
+          <w:rFonts w:ascii="Times New Roman" w:hAnsi="Times New Roman" w:cs="Times New Roman"/>
+          <w:sz w:val="22"/>
+          <w:szCs w:val="22"/>
+          <w:lang w:val="en-US"/>
+        </w:rPr>
+        <w:t>”</w:t>
+      </w:r>
+      <w:r>
+        <w:rPr>
+          <w:rFonts w:ascii="Times New Roman" w:hAnsi="Times New Roman" w:cs="Times New Roman"/>
+          <w:sz w:val="22"/>
+          <w:szCs w:val="22"/>
+          <w:lang w:val="en-US"/>
+        </w:rPr>
+        <w:t xml:space="preserve"> or </w:t>
+      </w:r>
+      <w:r>
+        <w:rPr>
+          <w:rFonts w:ascii="Times New Roman" w:hAnsi="Times New Roman" w:cs="Times New Roman"/>
+          <w:sz w:val="22"/>
+          <w:szCs w:val="22"/>
+          <w:lang w:val="en-US"/>
+        </w:rPr>
+        <w:t>“</w:t>
+      </w:r>
+      <w:r>
+        <w:rPr>
+          <w:rFonts w:ascii="Times New Roman" w:hAnsi="Times New Roman" w:cs="Times New Roman"/>
+          <w:sz w:val="22"/>
+          <w:szCs w:val="22"/>
+          <w:lang w:val="en-US"/>
+        </w:rPr>
+        <w:t>Chat</w:t>
+      </w:r>
+      <w:r>
+        <w:rPr>
+          <w:rFonts w:ascii="Times New Roman" w:hAnsi="Times New Roman" w:cs="Times New Roman"/>
+          <w:sz w:val="22"/>
+          <w:szCs w:val="22"/>
+          <w:lang w:val="en-US"/>
+        </w:rPr>
+        <w:t>”</w:t>
+      </w:r>
+      <w:r>
+        <w:rPr>
+          <w:rFonts w:ascii="Times New Roman" w:hAnsi="Times New Roman" w:cs="Times New Roman"/>
+          <w:sz w:val="22"/>
+          <w:szCs w:val="22"/>
+          <w:lang w:val="en-US"/>
+        </w:rPr>
+        <w:t xml:space="preserve">) is represented as an isolated, self-contained </w:t>
+      </w:r>
+      <w:r>
+        <w:rPr>
+          <w:rFonts w:ascii="Times New Roman" w:hAnsi="Times New Roman" w:cs="Times New Roman" w:hint="eastAsia"/>
+          <w:sz w:val="22"/>
+          <w:szCs w:val="22"/>
+          <w:lang w:val="en-US"/>
+        </w:rPr>
+        <w:t>functional</w:t>
+      </w:r>
+      <w:r>
+        <w:rPr>
+          <w:rFonts w:ascii="Times New Roman" w:hAnsi="Times New Roman" w:cs="Times New Roman"/>
+          <w:sz w:val="22"/>
+          <w:szCs w:val="22"/>
+          <w:lang w:val="en-US"/>
+        </w:rPr>
+        <w:t xml:space="preserve"> component</w:t>
       </w:r>
       <w:r>
         <w:rPr>
@@ -1048,27 +1582,43 @@
           <w:szCs w:val="22"/>
           <w:lang w:val="en-US"/>
         </w:rPr>
-        <w:t>for example, “-</w:t>
-      </w:r>
-      <w:proofErr w:type="spellStart"/>
-      <w:r>
-        <w:rPr>
-          <w:rFonts w:ascii="Times New Roman" w:hAnsi="Times New Roman" w:cs="Times New Roman"/>
-          <w:sz w:val="22"/>
-          <w:szCs w:val="22"/>
-          <w:lang w:val="en-US"/>
-        </w:rPr>
-        <w:t>mapInstance</w:t>
-      </w:r>
-      <w:proofErr w:type="spellEnd"/>
-      <w:r>
-        <w:rPr>
-          <w:rFonts w:ascii="Times New Roman" w:hAnsi="Times New Roman" w:cs="Times New Roman"/>
-          <w:sz w:val="22"/>
-          <w:szCs w:val="22"/>
-          <w:lang w:val="en-US"/>
-        </w:rPr>
-        <w:t xml:space="preserve"> [State]” within the mapping component</w:t>
+        <w:t xml:space="preserve">for example, </w:t>
+      </w:r>
+      <w:r>
+        <w:rPr>
+          <w:rFonts w:ascii="Times New Roman" w:hAnsi="Times New Roman" w:cs="Times New Roman"/>
+          <w:sz w:val="22"/>
+          <w:szCs w:val="22"/>
+          <w:lang w:val="en-US"/>
+        </w:rPr>
+        <w:t>“</w:t>
+      </w:r>
+      <w:r>
+        <w:rPr>
+          <w:rFonts w:ascii="Times New Roman" w:hAnsi="Times New Roman" w:cs="Times New Roman"/>
+          <w:sz w:val="22"/>
+          <w:szCs w:val="22"/>
+          <w:lang w:val="en-US"/>
+        </w:rPr>
+        <w:t>-mapInstance [State]</w:t>
+      </w:r>
+      <w:r>
+        <w:rPr>
+          <w:rFonts w:ascii="Times New Roman" w:hAnsi="Times New Roman" w:cs="Times New Roman"/>
+          <w:sz w:val="22"/>
+          <w:szCs w:val="22"/>
+          <w:lang w:val="en-US"/>
+        </w:rPr>
+        <w:t>”</w:t>
+      </w:r>
+      <w:r>
+        <w:rPr>
+          <w:rFonts w:ascii="Times New Roman" w:hAnsi="Times New Roman" w:cs="Times New Roman"/>
+          <w:sz w:val="22"/>
+          <w:szCs w:val="22"/>
+          <w:lang w:val="en-US"/>
+        </w:rPr>
+        <w:t xml:space="preserve"> within the mapping component</w:t>
       </w:r>
       <w:r>
         <w:rPr>
@@ -1086,9 +1636,17 @@
           <w:szCs w:val="22"/>
           <w:lang w:val="en-US"/>
         </w:rPr>
-        <w:t>while explicitly declaring their core event handlers (e.g., “</w:t>
-      </w:r>
-      <w:proofErr w:type="spellStart"/>
+        <w:t xml:space="preserve">while explicitly declaring their core event handlers (e.g., </w:t>
+      </w:r>
+      <w:r>
+        <w:rPr>
+          <w:rFonts w:ascii="Times New Roman" w:hAnsi="Times New Roman" w:cs="Times New Roman"/>
+          <w:sz w:val="22"/>
+          <w:szCs w:val="22"/>
+          <w:lang w:val="en-US"/>
+        </w:rPr>
+        <w:t>“</w:t>
+      </w:r>
       <w:r>
         <w:rPr>
           <w:rFonts w:ascii="Times New Roman" w:hAnsi="Times New Roman" w:cs="Times New Roman"/>
@@ -1098,17 +1656,33 @@
         </w:rPr>
         <w:t>handleSubmit</w:t>
       </w:r>
-      <w:proofErr w:type="spellEnd"/>
-      <w:r>
-        <w:rPr>
-          <w:rFonts w:ascii="Times New Roman" w:hAnsi="Times New Roman" w:cs="Times New Roman"/>
-          <w:sz w:val="22"/>
-          <w:szCs w:val="22"/>
-          <w:lang w:val="en-US"/>
-        </w:rPr>
-        <w:t>”, “</w:t>
-      </w:r>
-      <w:proofErr w:type="spellStart"/>
+      <w:r>
+        <w:rPr>
+          <w:rFonts w:ascii="Times New Roman" w:hAnsi="Times New Roman" w:cs="Times New Roman"/>
+          <w:sz w:val="22"/>
+          <w:szCs w:val="22"/>
+          <w:lang w:val="en-US"/>
+        </w:rPr>
+        <w:t>”</w:t>
+      </w:r>
+      <w:r>
+        <w:rPr>
+          <w:rFonts w:ascii="Times New Roman" w:hAnsi="Times New Roman" w:cs="Times New Roman"/>
+          <w:sz w:val="22"/>
+          <w:szCs w:val="22"/>
+          <w:lang w:val="en-US"/>
+        </w:rPr>
+        <w:t xml:space="preserve">, </w:t>
+      </w:r>
+      <w:r>
+        <w:rPr>
+          <w:rFonts w:ascii="Times New Roman" w:hAnsi="Times New Roman" w:cs="Times New Roman"/>
+          <w:sz w:val="22"/>
+          <w:szCs w:val="22"/>
+          <w:lang w:val="en-US"/>
+        </w:rPr>
+        <w:t>“</w:t>
+      </w:r>
       <w:r>
         <w:rPr>
           <w:rFonts w:ascii="Times New Roman" w:hAnsi="Times New Roman" w:cs="Times New Roman"/>
@@ -1118,15 +1692,32 @@
         </w:rPr>
         <w:t>handlePlanJourney</w:t>
       </w:r>
-      <w:proofErr w:type="spellEnd"/>
-      <w:r>
-        <w:rPr>
-          <w:rFonts w:ascii="Times New Roman" w:hAnsi="Times New Roman" w:cs="Times New Roman"/>
-          <w:sz w:val="22"/>
-          <w:szCs w:val="22"/>
-          <w:lang w:val="en-US"/>
-        </w:rPr>
-        <w:t xml:space="preserve">”) as public methods. </w:t>
+      <w:r>
+        <w:rPr>
+          <w:rFonts w:ascii="Times New Roman" w:hAnsi="Times New Roman" w:cs="Times New Roman"/>
+          <w:sz w:val="22"/>
+          <w:szCs w:val="22"/>
+          <w:lang w:val="en-US"/>
+        </w:rPr>
+        <w:t>”</w:t>
+      </w:r>
+      <w:r>
+        <w:rPr>
+          <w:rFonts w:ascii="Times New Roman" w:hAnsi="Times New Roman" w:cs="Times New Roman"/>
+          <w:sz w:val="22"/>
+          <w:szCs w:val="22"/>
+          <w:lang w:val="en-US"/>
+        </w:rPr>
+        <w:t>) as public methods.</w:t>
+      </w:r>
+      <w:r>
+        <w:rPr>
+          <w:rFonts w:ascii="Times New Roman" w:hAnsi="Times New Roman" w:cs="Times New Roman"/>
+          <w:sz w:val="22"/>
+          <w:szCs w:val="22"/>
+          <w:lang w:val="en-US"/>
+        </w:rPr>
+        <w:t xml:space="preserve"> </w:t>
       </w:r>
     </w:p>
     <w:p>
@@ -1164,7 +1755,43 @@
           <w:szCs w:val="22"/>
           <w:lang w:val="en-US"/>
         </w:rPr>
-        <w:t xml:space="preserve">eb application, we utilized “navigate” dependency arrows between these </w:t>
+        <w:t xml:space="preserve">eb application, we utilized </w:t>
+      </w:r>
+      <w:r>
+        <w:rPr>
+          <w:rFonts w:ascii="Times New Roman" w:hAnsi="Times New Roman" w:cs="Times New Roman"/>
+          <w:sz w:val="22"/>
+          <w:szCs w:val="22"/>
+          <w:lang w:val="en-US"/>
+        </w:rPr>
+        <w:t>“</w:t>
+      </w:r>
+      <w:r>
+        <w:rPr>
+          <w:rFonts w:ascii="Times New Roman" w:hAnsi="Times New Roman" w:cs="Times New Roman"/>
+          <w:sz w:val="22"/>
+          <w:szCs w:val="22"/>
+          <w:lang w:val="en-US"/>
+        </w:rPr>
+        <w:t>navigate</w:t>
+      </w:r>
+      <w:r>
+        <w:rPr>
+          <w:rFonts w:ascii="Times New Roman" w:hAnsi="Times New Roman" w:cs="Times New Roman"/>
+          <w:sz w:val="22"/>
+          <w:szCs w:val="22"/>
+          <w:lang w:val="en-US"/>
+        </w:rPr>
+        <w:t>”</w:t>
+      </w:r>
+      <w:r>
+        <w:rPr>
+          <w:rFonts w:ascii="Times New Roman" w:hAnsi="Times New Roman" w:cs="Times New Roman"/>
+          <w:sz w:val="22"/>
+          <w:szCs w:val="22"/>
+          <w:lang w:val="en-US"/>
+        </w:rPr>
+        <w:t xml:space="preserve"> dependency arrows between these </w:t>
       </w:r>
       <w:r>
         <w:rPr>
@@ -1211,7 +1838,15 @@
           <w:sz w:val="22"/>
           <w:szCs w:val="22"/>
         </w:rPr>
-        <w:t>3.3 Sequence Diagrams of Core Use Cases</w:t>
+        <w:t xml:space="preserve">3.3 </w:t>
+      </w:r>
+      <w:r>
+        <w:rPr>
+          <w:rFonts w:ascii="Times New Roman" w:hAnsi="Times New Roman" w:cs="Times New Roman"/>
+          <w:sz w:val="22"/>
+          <w:szCs w:val="22"/>
+        </w:rPr>
+        <w:t>Sequence Diagrams of Core Use Cases</w:t>
       </w:r>
     </w:p>
     <w:p>
@@ -1219,13 +1854,11 @@
         <w:keepNext/>
         <w:spacing w:line="240" w:lineRule="auto"/>
         <w:rPr>
-          <w:rFonts w:ascii="Times New Roman" w:hAnsi="Times New Roman" w:cs="Times New Roman"/>
-          <w:lang w:val="en-US"/>
-        </w:rPr>
-      </w:pPr>
-      <w:r>
-        <w:rPr>
-          <w:rFonts w:ascii="Times New Roman" w:hAnsi="Times New Roman" w:cs="Times New Roman"/>
+          <w:lang w:val="en-US"/>
+        </w:rPr>
+      </w:pPr>
+      <w:r>
+        <w:rPr>
           <w:noProof/>
           <w:lang w:val="en-US"/>
         </w:rPr>
@@ -1273,90 +1906,31 @@
         <w:jc w:val="center"/>
         <w:rPr>
           <w:rFonts w:ascii="Times New Roman" w:hAnsi="Times New Roman" w:cs="Times New Roman"/>
-          <w:sz w:val="16"/>
-          <w:szCs w:val="16"/>
-        </w:rPr>
-      </w:pPr>
-      <w:r>
-        <w:rPr>
-          <w:rFonts w:ascii="Times New Roman" w:hAnsi="Times New Roman" w:cs="Times New Roman"/>
-          <w:sz w:val="16"/>
-          <w:szCs w:val="16"/>
-        </w:rPr>
+          <w:sz w:val="22"/>
+          <w:szCs w:val="22"/>
+        </w:rPr>
+      </w:pPr>
+      <w:r>
         <w:t xml:space="preserve">Figure </w:t>
       </w:r>
       <w:r>
-        <w:rPr>
-          <w:rFonts w:ascii="Times New Roman" w:hAnsi="Times New Roman" w:cs="Times New Roman"/>
-          <w:sz w:val="16"/>
-          <w:szCs w:val="16"/>
-        </w:rPr>
         <w:t>3.</w:t>
       </w:r>
-      <w:r>
-        <w:rPr>
-          <w:rFonts w:ascii="Times New Roman" w:hAnsi="Times New Roman" w:cs="Times New Roman"/>
-          <w:sz w:val="16"/>
-          <w:szCs w:val="16"/>
-        </w:rPr>
-        <w:fldChar w:fldCharType="begin"/>
-      </w:r>
-      <w:r>
-        <w:rPr>
-          <w:rFonts w:ascii="Times New Roman" w:hAnsi="Times New Roman" w:cs="Times New Roman"/>
-          <w:sz w:val="16"/>
-          <w:szCs w:val="16"/>
-        </w:rPr>
-        <w:instrText xml:space="preserve"> SEQ Figure \* ARABIC </w:instrText>
-      </w:r>
-      <w:r>
-        <w:rPr>
-          <w:rFonts w:ascii="Times New Roman" w:hAnsi="Times New Roman" w:cs="Times New Roman"/>
-          <w:sz w:val="16"/>
-          <w:szCs w:val="16"/>
-        </w:rPr>
-        <w:fldChar w:fldCharType="separate"/>
-      </w:r>
-      <w:r>
-        <w:rPr>
-          <w:rFonts w:ascii="Times New Roman" w:hAnsi="Times New Roman" w:cs="Times New Roman"/>
-          <w:noProof/>
-          <w:sz w:val="16"/>
-          <w:szCs w:val="16"/>
-        </w:rPr>
-        <w:t>4</w:t>
-      </w:r>
-      <w:r>
-        <w:rPr>
-          <w:rFonts w:ascii="Times New Roman" w:hAnsi="Times New Roman" w:cs="Times New Roman"/>
-          <w:noProof/>
-          <w:sz w:val="16"/>
-          <w:szCs w:val="16"/>
-        </w:rPr>
-        <w:fldChar w:fldCharType="end"/>
-      </w:r>
-      <w:r>
-        <w:rPr>
-          <w:rFonts w:ascii="Times New Roman" w:hAnsi="Times New Roman" w:cs="Times New Roman"/>
-          <w:sz w:val="16"/>
-          <w:szCs w:val="16"/>
-        </w:rPr>
+      <w:fldSimple w:instr=" SEQ Figure \* ARABIC ">
+        <w:r>
+          <w:rPr>
+            <w:noProof/>
+          </w:rPr>
+          <w:t>4</w:t>
+        </w:r>
+      </w:fldSimple>
+      <w:r>
         <w:t xml:space="preserve"> User Login </w:t>
       </w:r>
       <w:r>
-        <w:rPr>
-          <w:rFonts w:ascii="Times New Roman" w:hAnsi="Times New Roman" w:cs="Times New Roman"/>
-          <w:sz w:val="16"/>
-          <w:szCs w:val="16"/>
-        </w:rPr>
         <w:t>and</w:t>
       </w:r>
       <w:r>
-        <w:rPr>
-          <w:rFonts w:ascii="Times New Roman" w:hAnsi="Times New Roman" w:cs="Times New Roman"/>
-          <w:sz w:val="16"/>
-          <w:szCs w:val="16"/>
-        </w:rPr>
         <w:t xml:space="preserve"> Session Creation</w:t>
       </w:r>
     </w:p>
@@ -1375,7 +1949,15 @@
           <w:sz w:val="22"/>
           <w:szCs w:val="22"/>
         </w:rPr>
-        <w:t xml:space="preserve">User Login (Figure </w:t>
+        <w:t>User Login</w:t>
+      </w:r>
+      <w:r>
+        <w:rPr>
+          <w:rFonts w:ascii="Times New Roman" w:hAnsi="Times New Roman" w:cs="Times New Roman"/>
+          <w:sz w:val="22"/>
+          <w:szCs w:val="22"/>
+        </w:rPr>
+        <w:t xml:space="preserve"> (Figure </w:t>
       </w:r>
       <w:r>
         <w:rPr>
@@ -1387,7 +1969,7 @@
       </w:r>
       <w:r>
         <w:rPr>
-          <w:rFonts w:ascii="Times New Roman" w:hAnsi="Times New Roman" w:cs="Times New Roman"/>
+          <w:rFonts w:ascii="Times New Roman" w:hAnsi="Times New Roman" w:cs="Times New Roman" w:hint="eastAsia"/>
           <w:sz w:val="22"/>
           <w:szCs w:val="22"/>
         </w:rPr>
@@ -1418,23 +2000,13 @@
         </w:rPr>
         <w:t>“</w:t>
       </w:r>
-      <w:proofErr w:type="spellStart"/>
-      <w:r>
-        <w:rPr>
-          <w:rFonts w:ascii="Times New Roman" w:hAnsi="Times New Roman" w:cs="Times New Roman"/>
-          <w:sz w:val="22"/>
-          <w:szCs w:val="22"/>
-        </w:rPr>
-        <w:t>loginPage</w:t>
-      </w:r>
-      <w:proofErr w:type="spellEnd"/>
-      <w:r>
-        <w:rPr>
-          <w:rFonts w:ascii="Times New Roman" w:hAnsi="Times New Roman" w:cs="Times New Roman"/>
-          <w:sz w:val="22"/>
-          <w:szCs w:val="22"/>
-        </w:rPr>
-        <w:t>: Login</w:t>
+      <w:r>
+        <w:rPr>
+          <w:rFonts w:ascii="Times New Roman" w:hAnsi="Times New Roman" w:cs="Times New Roman"/>
+          <w:sz w:val="22"/>
+          <w:szCs w:val="22"/>
+        </w:rPr>
+        <w:t>loginPage: Login</w:t>
       </w:r>
       <w:r>
         <w:rPr>
@@ -1462,7 +2034,6 @@
         </w:rPr>
         <w:t>“</w:t>
       </w:r>
-      <w:proofErr w:type="spellStart"/>
       <w:proofErr w:type="gramStart"/>
       <w:r>
         <w:rPr>
@@ -1470,16 +2041,7 @@
           <w:sz w:val="22"/>
           <w:szCs w:val="22"/>
         </w:rPr>
-        <w:t>handleSubmit</w:t>
-      </w:r>
-      <w:proofErr w:type="spellEnd"/>
-      <w:r>
-        <w:rPr>
-          <w:rFonts w:ascii="Times New Roman" w:hAnsi="Times New Roman" w:cs="Times New Roman"/>
-          <w:sz w:val="22"/>
-          <w:szCs w:val="22"/>
-        </w:rPr>
-        <w:t>(</w:t>
+        <w:t>handleSubmit(</w:t>
       </w:r>
       <w:proofErr w:type="gramEnd"/>
       <w:r>
@@ -1496,7 +2058,15 @@
           <w:sz w:val="22"/>
           <w:szCs w:val="22"/>
         </w:rPr>
-        <w:t xml:space="preserve">”. The payload routes through </w:t>
+        <w:t>”</w:t>
+      </w:r>
+      <w:r>
+        <w:rPr>
+          <w:rFonts w:ascii="Times New Roman" w:hAnsi="Times New Roman" w:cs="Times New Roman"/>
+          <w:sz w:val="22"/>
+          <w:szCs w:val="22"/>
+        </w:rPr>
+        <w:t xml:space="preserve">. The payload routes through </w:t>
       </w:r>
       <w:r>
         <w:rPr>
@@ -1507,7 +2077,6 @@
         </w:rPr>
         <w:t>“</w:t>
       </w:r>
-      <w:proofErr w:type="spellStart"/>
       <w:r>
         <w:rPr>
           <w:rFonts w:ascii="Times New Roman" w:hAnsi="Times New Roman" w:cs="Times New Roman"/>
@@ -1516,7 +2085,6 @@
         </w:rPr>
         <w:t>userService</w:t>
       </w:r>
-      <w:proofErr w:type="spellEnd"/>
       <w:r>
         <w:rPr>
           <w:rFonts w:ascii="Times New Roman" w:hAnsi="Times New Roman" w:cs="Times New Roman"/>
@@ -1531,9 +2099,16 @@
           <w:sz w:val="22"/>
           <w:szCs w:val="22"/>
         </w:rPr>
-        <w:t xml:space="preserve"> which executes “</w:t>
-      </w:r>
-      <w:proofErr w:type="spellStart"/>
+        <w:t xml:space="preserve"> which executes </w:t>
+      </w:r>
+      <w:r>
+        <w:rPr>
+          <w:rFonts w:ascii="Times New Roman" w:hAnsi="Times New Roman" w:cs="Times New Roman"/>
+          <w:sz w:val="22"/>
+          <w:szCs w:val="22"/>
+        </w:rPr>
+        <w:t>“</w:t>
+      </w:r>
       <w:r>
         <w:rPr>
           <w:rFonts w:ascii="Times New Roman" w:hAnsi="Times New Roman" w:cs="Times New Roman"/>
@@ -1549,16 +2124,7 @@
           <w:sz w:val="22"/>
           <w:szCs w:val="22"/>
         </w:rPr>
-        <w:t>user</w:t>
-      </w:r>
-      <w:proofErr w:type="spellEnd"/>
-      <w:r>
-        <w:rPr>
-          <w:rFonts w:ascii="Times New Roman" w:hAnsi="Times New Roman" w:cs="Times New Roman"/>
-          <w:sz w:val="22"/>
-          <w:szCs w:val="22"/>
-        </w:rPr>
-        <w:t>(</w:t>
+        <w:t>user(</w:t>
       </w:r>
       <w:proofErr w:type="gramEnd"/>
       <w:r>
@@ -1567,17 +2133,40 @@
           <w:sz w:val="22"/>
           <w:szCs w:val="22"/>
         </w:rPr>
-        <w:t xml:space="preserve">)”, </w:t>
-      </w:r>
-      <w:r>
-        <w:rPr>
-          <w:rFonts w:ascii="Times New Roman" w:hAnsi="Times New Roman" w:cs="Times New Roman"/>
-          <w:sz w:val="22"/>
-          <w:szCs w:val="22"/>
-        </w:rPr>
-        <w:t>performs an inline database query to retrieve the user record, verifies passwords using the “</w:t>
-      </w:r>
-      <w:proofErr w:type="spellStart"/>
+        <w:t>)</w:t>
+      </w:r>
+      <w:r>
+        <w:rPr>
+          <w:rFonts w:ascii="Times New Roman" w:hAnsi="Times New Roman" w:cs="Times New Roman"/>
+          <w:sz w:val="22"/>
+          <w:szCs w:val="22"/>
+        </w:rPr>
+        <w:t>”</w:t>
+      </w:r>
+      <w:r>
+        <w:rPr>
+          <w:rFonts w:ascii="Times New Roman" w:hAnsi="Times New Roman" w:cs="Times New Roman"/>
+          <w:sz w:val="22"/>
+          <w:szCs w:val="22"/>
+        </w:rPr>
+        <w:t xml:space="preserve">, </w:t>
+      </w:r>
+      <w:r>
+        <w:rPr>
+          <w:rFonts w:ascii="Times New Roman" w:hAnsi="Times New Roman" w:cs="Times New Roman"/>
+          <w:sz w:val="22"/>
+          <w:szCs w:val="22"/>
+        </w:rPr>
+        <w:t xml:space="preserve">performs an inline database query to retrieve the user record, verifies passwords using the </w:t>
+      </w:r>
+      <w:r>
+        <w:rPr>
+          <w:rFonts w:ascii="Times New Roman" w:hAnsi="Times New Roman" w:cs="Times New Roman"/>
+          <w:sz w:val="22"/>
+          <w:szCs w:val="22"/>
+        </w:rPr>
+        <w:t>“</w:t>
+      </w:r>
       <w:proofErr w:type="gramStart"/>
       <w:r>
         <w:rPr>
@@ -1587,7 +2176,6 @@
         </w:rPr>
         <w:t>werkzeug.security</w:t>
       </w:r>
-      <w:proofErr w:type="spellEnd"/>
       <w:proofErr w:type="gramEnd"/>
       <w:r>
         <w:rPr>
@@ -1595,17 +2183,32 @@
           <w:sz w:val="22"/>
           <w:szCs w:val="22"/>
         </w:rPr>
-        <w:t>” library,</w:t>
-      </w:r>
-      <w:r>
-        <w:rPr>
-          <w:rFonts w:ascii="Times New Roman" w:hAnsi="Times New Roman" w:cs="Times New Roman"/>
-          <w:sz w:val="22"/>
-          <w:szCs w:val="22"/>
-        </w:rPr>
-        <w:t xml:space="preserve"> and concludes with the UI instance calling “</w:t>
-      </w:r>
-      <w:proofErr w:type="spellStart"/>
+        <w:t>”</w:t>
+      </w:r>
+      <w:r>
+        <w:rPr>
+          <w:rFonts w:ascii="Times New Roman" w:hAnsi="Times New Roman" w:cs="Times New Roman"/>
+          <w:sz w:val="22"/>
+          <w:szCs w:val="22"/>
+        </w:rPr>
+        <w:t xml:space="preserve"> library,</w:t>
+      </w:r>
+      <w:r>
+        <w:rPr>
+          <w:rFonts w:ascii="Times New Roman" w:hAnsi="Times New Roman" w:cs="Times New Roman"/>
+          <w:sz w:val="22"/>
+          <w:szCs w:val="22"/>
+        </w:rPr>
+        <w:t xml:space="preserve"> and concludes with the UI instance calling </w:t>
+      </w:r>
+      <w:r>
+        <w:rPr>
+          <w:rFonts w:ascii="Times New Roman" w:hAnsi="Times New Roman" w:cs="Times New Roman"/>
+          <w:sz w:val="22"/>
+          <w:szCs w:val="22"/>
+        </w:rPr>
+        <w:t>“</w:t>
+      </w:r>
       <w:proofErr w:type="gramStart"/>
       <w:r>
         <w:rPr>
@@ -1613,16 +2216,7 @@
           <w:sz w:val="22"/>
           <w:szCs w:val="22"/>
         </w:rPr>
-        <w:t>setAuthTokens</w:t>
-      </w:r>
-      <w:proofErr w:type="spellEnd"/>
-      <w:r>
-        <w:rPr>
-          <w:rFonts w:ascii="Times New Roman" w:hAnsi="Times New Roman" w:cs="Times New Roman"/>
-          <w:sz w:val="22"/>
-          <w:szCs w:val="22"/>
-        </w:rPr>
-        <w:t>(</w:t>
+        <w:t>setAuthTokens(</w:t>
       </w:r>
       <w:proofErr w:type="gramEnd"/>
       <w:r>
@@ -1639,7 +2233,23 @@
           <w:sz w:val="22"/>
           <w:szCs w:val="22"/>
         </w:rPr>
-        <w:t>” and “</w:t>
+        <w:t>”</w:t>
+      </w:r>
+      <w:r>
+        <w:rPr>
+          <w:rFonts w:ascii="Times New Roman" w:hAnsi="Times New Roman" w:cs="Times New Roman"/>
+          <w:sz w:val="22"/>
+          <w:szCs w:val="22"/>
+        </w:rPr>
+        <w:t xml:space="preserve"> and </w:t>
+      </w:r>
+      <w:r>
+        <w:rPr>
+          <w:rFonts w:ascii="Times New Roman" w:hAnsi="Times New Roman" w:cs="Times New Roman"/>
+          <w:sz w:val="22"/>
+          <w:szCs w:val="22"/>
+        </w:rPr>
+        <w:t>“</w:t>
       </w:r>
       <w:r>
         <w:rPr>
@@ -1655,7 +2265,15 @@
           <w:sz w:val="22"/>
           <w:szCs w:val="22"/>
         </w:rPr>
-        <w:t>”.</w:t>
+        <w:t>”</w:t>
+      </w:r>
+      <w:r>
+        <w:rPr>
+          <w:rFonts w:ascii="Times New Roman" w:hAnsi="Times New Roman" w:cs="Times New Roman"/>
+          <w:sz w:val="22"/>
+          <w:szCs w:val="22"/>
+        </w:rPr>
+        <w:t>.</w:t>
       </w:r>
     </w:p>
     <w:p>
@@ -1672,13 +2290,9 @@
       <w:pPr>
         <w:keepNext/>
         <w:spacing w:line="240" w:lineRule="auto"/>
-        <w:rPr>
-          <w:rFonts w:ascii="Times New Roman" w:hAnsi="Times New Roman" w:cs="Times New Roman"/>
-        </w:rPr>
-      </w:pPr>
-      <w:r>
-        <w:rPr>
-          <w:rFonts w:ascii="Times New Roman" w:hAnsi="Times New Roman" w:cs="Times New Roman"/>
+      </w:pPr>
+      <w:r>
+        <w:rPr>
           <w:noProof/>
         </w:rPr>
         <w:drawing>
@@ -1729,60 +2343,22 @@
         </w:rPr>
       </w:pPr>
       <w:r>
-        <w:rPr>
-          <w:rFonts w:ascii="Times New Roman" w:hAnsi="Times New Roman" w:cs="Times New Roman"/>
-          <w:sz w:val="16"/>
-          <w:szCs w:val="16"/>
-        </w:rPr>
-        <w:t>Figure</w:t>
-      </w:r>
-      <w:r>
-        <w:rPr>
-          <w:rFonts w:ascii="Times New Roman" w:hAnsi="Times New Roman" w:cs="Times New Roman"/>
-        </w:rPr>
-        <w:t xml:space="preserve"> </w:t>
-      </w:r>
-      <w:r>
-        <w:rPr>
-          <w:rFonts w:ascii="Times New Roman" w:hAnsi="Times New Roman" w:cs="Times New Roman"/>
-        </w:rPr>
+        <w:t xml:space="preserve">Figure </w:t>
+      </w:r>
+      <w:r>
         <w:t>3.</w:t>
       </w:r>
-      <w:r>
-        <w:rPr>
-          <w:rFonts w:ascii="Times New Roman" w:hAnsi="Times New Roman" w:cs="Times New Roman"/>
-        </w:rPr>
-        <w:fldChar w:fldCharType="begin"/>
-      </w:r>
-      <w:r>
-        <w:rPr>
-          <w:rFonts w:ascii="Times New Roman" w:hAnsi="Times New Roman" w:cs="Times New Roman"/>
-        </w:rPr>
-        <w:instrText xml:space="preserve"> SEQ Figure \* ARABIC </w:instrText>
-      </w:r>
-      <w:r>
-        <w:rPr>
-          <w:rFonts w:ascii="Times New Roman" w:hAnsi="Times New Roman" w:cs="Times New Roman"/>
-        </w:rPr>
-        <w:fldChar w:fldCharType="separate"/>
-      </w:r>
-      <w:r>
-        <w:rPr>
-          <w:rFonts w:ascii="Times New Roman" w:hAnsi="Times New Roman" w:cs="Times New Roman"/>
-          <w:noProof/>
-        </w:rPr>
-        <w:t>5</w:t>
-      </w:r>
-      <w:r>
-        <w:rPr>
-          <w:rFonts w:ascii="Times New Roman" w:hAnsi="Times New Roman" w:cs="Times New Roman"/>
-          <w:noProof/>
-        </w:rPr>
-        <w:fldChar w:fldCharType="end"/>
-      </w:r>
-      <w:r>
-        <w:rPr>
-          <w:rFonts w:ascii="Times New Roman" w:hAnsi="Times New Roman" w:cs="Times New Roman"/>
+      <w:fldSimple w:instr=" SEQ Figure \* ARABIC ">
+        <w:r>
+          <w:rPr>
+            <w:noProof/>
+          </w:rPr>
+          <w:t>5</w:t>
+        </w:r>
+      </w:fldSimple>
+      <w:r>
+        <w:rPr>
+          <w:rFonts w:hint="eastAsia"/>
         </w:rPr>
         <w:t xml:space="preserve"> Journey Planner</w:t>
       </w:r>
@@ -1805,7 +2381,16 @@
           <w:lang w:val="en-US"/>
         </w:rPr>
         <w:lastRenderedPageBreak/>
-        <w:t xml:space="preserve">Journey Planner (Figure </w:t>
+        <w:t>Journey Planner (</w:t>
+      </w:r>
+      <w:r>
+        <w:rPr>
+          <w:rFonts w:ascii="Times New Roman" w:hAnsi="Times New Roman" w:cs="Times New Roman"/>
+          <w:sz w:val="22"/>
+          <w:szCs w:val="22"/>
+          <w:lang w:val="en-US"/>
+        </w:rPr>
+        <w:t xml:space="preserve">Figure </w:t>
       </w:r>
       <w:r>
         <w:rPr>
@@ -1818,7 +2403,7 @@
       </w:r>
       <w:r>
         <w:rPr>
-          <w:rFonts w:ascii="Times New Roman" w:hAnsi="Times New Roman" w:cs="Times New Roman"/>
+          <w:rFonts w:ascii="Times New Roman" w:hAnsi="Times New Roman" w:cs="Times New Roman" w:hint="eastAsia"/>
           <w:sz w:val="22"/>
           <w:szCs w:val="22"/>
           <w:lang w:val="en-US"/>
@@ -1827,43 +2412,76 @@
       </w:r>
       <w:r>
         <w:rPr>
-          <w:rFonts w:ascii="Times New Roman" w:hAnsi="Times New Roman" w:cs="Times New Roman"/>
-          <w:sz w:val="22"/>
-          <w:szCs w:val="22"/>
-          <w:lang w:val="en-US"/>
-        </w:rPr>
-        <w:t xml:space="preserve">): </w:t>
-      </w:r>
-      <w:r>
-        <w:rPr>
-          <w:rFonts w:ascii="Times New Roman" w:hAnsi="Times New Roman" w:cs="Times New Roman"/>
-          <w:sz w:val="22"/>
-          <w:szCs w:val="22"/>
-          <w:lang w:val="en-US"/>
-        </w:rPr>
-        <w:t>Initiated from “</w:t>
-      </w:r>
-      <w:proofErr w:type="spellStart"/>
-      <w:r>
-        <w:rPr>
-          <w:rFonts w:ascii="Times New Roman" w:hAnsi="Times New Roman" w:cs="Times New Roman"/>
-          <w:sz w:val="22"/>
-          <w:szCs w:val="22"/>
-          <w:lang w:val="en-US"/>
-        </w:rPr>
-        <w:t>mapsPage</w:t>
-      </w:r>
-      <w:proofErr w:type="spellEnd"/>
-      <w:r>
-        <w:rPr>
-          <w:rFonts w:ascii="Times New Roman" w:hAnsi="Times New Roman" w:cs="Times New Roman"/>
-          <w:sz w:val="22"/>
-          <w:szCs w:val="22"/>
-          <w:lang w:val="en-US"/>
-        </w:rPr>
-        <w:t>: Maps”, the “</w:t>
-      </w:r>
-      <w:proofErr w:type="spellStart"/>
+          <w:rFonts w:ascii="Times New Roman" w:hAnsi="Times New Roman" w:cs="Times New Roman" w:hint="eastAsia"/>
+          <w:sz w:val="22"/>
+          <w:szCs w:val="22"/>
+          <w:lang w:val="en-US"/>
+        </w:rPr>
+        <w:t>)</w:t>
+      </w:r>
+      <w:r>
+        <w:rPr>
+          <w:rFonts w:ascii="Times New Roman" w:hAnsi="Times New Roman" w:cs="Times New Roman"/>
+          <w:sz w:val="22"/>
+          <w:szCs w:val="22"/>
+          <w:lang w:val="en-US"/>
+        </w:rPr>
+        <w:t xml:space="preserve">: </w:t>
+      </w:r>
+      <w:r>
+        <w:rPr>
+          <w:rFonts w:ascii="Times New Roman" w:hAnsi="Times New Roman" w:cs="Times New Roman"/>
+          <w:sz w:val="22"/>
+          <w:szCs w:val="22"/>
+          <w:lang w:val="en-US"/>
+        </w:rPr>
+        <w:t xml:space="preserve">Initiated from </w:t>
+      </w:r>
+      <w:r>
+        <w:rPr>
+          <w:rFonts w:ascii="Times New Roman" w:hAnsi="Times New Roman" w:cs="Times New Roman"/>
+          <w:sz w:val="22"/>
+          <w:szCs w:val="22"/>
+          <w:lang w:val="en-US"/>
+        </w:rPr>
+        <w:t>“</w:t>
+      </w:r>
+      <w:r>
+        <w:rPr>
+          <w:rFonts w:ascii="Times New Roman" w:hAnsi="Times New Roman" w:cs="Times New Roman"/>
+          <w:sz w:val="22"/>
+          <w:szCs w:val="22"/>
+          <w:lang w:val="en-US"/>
+        </w:rPr>
+        <w:t>mapsPage: Maps</w:t>
+      </w:r>
+      <w:r>
+        <w:rPr>
+          <w:rFonts w:ascii="Times New Roman" w:hAnsi="Times New Roman" w:cs="Times New Roman"/>
+          <w:sz w:val="22"/>
+          <w:szCs w:val="22"/>
+          <w:lang w:val="en-US"/>
+        </w:rPr>
+        <w:t>”</w:t>
+      </w:r>
+      <w:r>
+        <w:rPr>
+          <w:rFonts w:ascii="Times New Roman" w:hAnsi="Times New Roman" w:cs="Times New Roman"/>
+          <w:sz w:val="22"/>
+          <w:szCs w:val="22"/>
+          <w:lang w:val="en-US"/>
+        </w:rPr>
+        <w:t xml:space="preserve">, the </w:t>
+      </w:r>
+      <w:r>
+        <w:rPr>
+          <w:rFonts w:ascii="Times New Roman" w:hAnsi="Times New Roman" w:cs="Times New Roman"/>
+          <w:sz w:val="22"/>
+          <w:szCs w:val="22"/>
+          <w:lang w:val="en-US"/>
+        </w:rPr>
+        <w:t>“</w:t>
+      </w:r>
       <w:r>
         <w:rPr>
           <w:rFonts w:ascii="Times New Roman" w:hAnsi="Times New Roman" w:cs="Times New Roman"/>
@@ -1873,15 +2491,23 @@
         </w:rPr>
         <w:t>journeyService</w:t>
       </w:r>
-      <w:proofErr w:type="spellEnd"/>
-      <w:r>
-        <w:rPr>
-          <w:rFonts w:ascii="Times New Roman" w:hAnsi="Times New Roman" w:cs="Times New Roman"/>
-          <w:sz w:val="22"/>
-          <w:szCs w:val="22"/>
-          <w:lang w:val="en-US"/>
-        </w:rPr>
-        <w:t xml:space="preserve">” instance coordinates complex routing. It leverages the </w:t>
+      <w:r>
+        <w:rPr>
+          <w:rFonts w:ascii="Times New Roman" w:hAnsi="Times New Roman" w:cs="Times New Roman"/>
+          <w:sz w:val="22"/>
+          <w:szCs w:val="22"/>
+          <w:lang w:val="en-US"/>
+        </w:rPr>
+        <w:t>”</w:t>
+      </w:r>
+      <w:r>
+        <w:rPr>
+          <w:rFonts w:ascii="Times New Roman" w:hAnsi="Times New Roman" w:cs="Times New Roman"/>
+          <w:sz w:val="22"/>
+          <w:szCs w:val="22"/>
+          <w:lang w:val="en-US"/>
+        </w:rPr>
+        <w:t xml:space="preserve"> instance coordinates complex routing. It leverages the </w:t>
       </w:r>
       <w:r>
         <w:rPr>
@@ -1892,7 +2518,6 @@
         </w:rPr>
         <w:t>“</w:t>
       </w:r>
-      <w:proofErr w:type="spellStart"/>
       <w:r>
         <w:rPr>
           <w:rFonts w:ascii="Times New Roman" w:hAnsi="Times New Roman" w:cs="Times New Roman"/>
@@ -1902,7 +2527,6 @@
         </w:rPr>
         <w:t>stationService</w:t>
       </w:r>
-      <w:proofErr w:type="spellEnd"/>
       <w:r>
         <w:rPr>
           <w:rFonts w:ascii="Times New Roman" w:hAnsi="Times New Roman" w:cs="Times New Roman"/>
@@ -1932,32 +2556,21 @@
       </w:r>
       <w:r>
         <w:rPr>
-          <w:rFonts w:ascii="Times New Roman" w:hAnsi="Times New Roman" w:cs="Times New Roman"/>
-          <w:sz w:val="22"/>
-          <w:szCs w:val="22"/>
-          <w:lang w:val="en-US"/>
-        </w:rPr>
-        <w:t xml:space="preserve"> (“</w:t>
-      </w:r>
-      <w:proofErr w:type="spellStart"/>
-      <w:r>
-        <w:rPr>
-          <w:rFonts w:ascii="Times New Roman" w:hAnsi="Times New Roman" w:cs="Times New Roman"/>
-          <w:sz w:val="22"/>
-          <w:szCs w:val="22"/>
-          <w:lang w:val="en-US"/>
-        </w:rPr>
-        <w:t>calculate_disrance</w:t>
-      </w:r>
-      <w:proofErr w:type="spellEnd"/>
-      <w:r>
-        <w:rPr>
-          <w:rFonts w:ascii="Times New Roman" w:hAnsi="Times New Roman" w:cs="Times New Roman"/>
-          <w:sz w:val="22"/>
-          <w:szCs w:val="22"/>
-          <w:lang w:val="en-US"/>
-        </w:rPr>
-        <w:t>”)</w:t>
+          <w:rFonts w:ascii="Times New Roman" w:hAnsi="Times New Roman" w:cs="Times New Roman" w:hint="eastAsia"/>
+          <w:sz w:val="22"/>
+          <w:szCs w:val="22"/>
+          <w:lang w:val="en-US"/>
+        </w:rPr>
+        <w:t xml:space="preserve"> </w:t>
+      </w:r>
+      <w:r>
+        <w:rPr>
+          <w:rFonts w:ascii="Times New Roman" w:hAnsi="Times New Roman" w:cs="Times New Roman"/>
+          <w:sz w:val="22"/>
+          <w:szCs w:val="22"/>
+          <w:lang w:val="en-US"/>
+        </w:rPr>
+        <w:t>(“calculate_disrance”)</w:t>
       </w:r>
       <w:r>
         <w:rPr>
@@ -1986,37 +2599,15 @@
         </w:rPr>
         <w:t>“</w:t>
       </w:r>
-      <w:proofErr w:type="spellStart"/>
-      <w:r>
-        <w:rPr>
-          <w:rFonts w:ascii="Times New Roman" w:hAnsi="Times New Roman" w:cs="Times New Roman"/>
-          <w:sz w:val="22"/>
-          <w:szCs w:val="22"/>
-          <w:lang w:val="en-US"/>
-        </w:rPr>
-        <w:t>gmapsClient</w:t>
-      </w:r>
-      <w:proofErr w:type="spellEnd"/>
-      <w:r>
-        <w:rPr>
-          <w:rFonts w:ascii="Times New Roman" w:hAnsi="Times New Roman" w:cs="Times New Roman"/>
-          <w:sz w:val="22"/>
-          <w:szCs w:val="22"/>
-          <w:lang w:val="en-US"/>
-        </w:rPr>
-        <w:t xml:space="preserve">: </w:t>
-      </w:r>
-      <w:proofErr w:type="spellStart"/>
-      <w:r>
-        <w:rPr>
-          <w:rFonts w:ascii="Times New Roman" w:hAnsi="Times New Roman" w:cs="Times New Roman"/>
-          <w:sz w:val="22"/>
-          <w:szCs w:val="22"/>
-          <w:lang w:val="en-US"/>
-        </w:rPr>
-        <w:t>GoogleMapsAPI</w:t>
-      </w:r>
-      <w:proofErr w:type="spellEnd"/>
+      <w:r>
+        <w:rPr>
+          <w:rFonts w:ascii="Times New Roman" w:hAnsi="Times New Roman" w:cs="Times New Roman"/>
+          <w:sz w:val="22"/>
+          <w:szCs w:val="22"/>
+          <w:lang w:val="en-US"/>
+        </w:rPr>
+        <w:t>gmapsClient: GoogleMapsAPI</w:t>
+      </w:r>
       <w:r>
         <w:rPr>
           <w:rFonts w:ascii="Times New Roman" w:hAnsi="Times New Roman" w:cs="Times New Roman"/>
@@ -2042,9 +2633,17 @@
           <w:szCs w:val="22"/>
           <w:lang w:val="en-US"/>
         </w:rPr>
-        <w:t>Finally, the UI instance calls “</w:t>
-      </w:r>
-      <w:proofErr w:type="spellStart"/>
+        <w:t xml:space="preserve">Finally, the UI instance calls </w:t>
+      </w:r>
+      <w:r>
+        <w:rPr>
+          <w:rFonts w:ascii="Times New Roman" w:hAnsi="Times New Roman" w:cs="Times New Roman"/>
+          <w:sz w:val="22"/>
+          <w:szCs w:val="22"/>
+          <w:lang w:val="en-US"/>
+        </w:rPr>
+        <w:t>“</w:t>
+      </w:r>
       <w:proofErr w:type="gramStart"/>
       <w:r>
         <w:rPr>
@@ -2053,17 +2652,7 @@
           <w:szCs w:val="22"/>
           <w:lang w:val="en-US"/>
         </w:rPr>
-        <w:t>setJourneyResult</w:t>
-      </w:r>
-      <w:proofErr w:type="spellEnd"/>
-      <w:r>
-        <w:rPr>
-          <w:rFonts w:ascii="Times New Roman" w:hAnsi="Times New Roman" w:cs="Times New Roman"/>
-          <w:sz w:val="22"/>
-          <w:szCs w:val="22"/>
-          <w:lang w:val="en-US"/>
-        </w:rPr>
-        <w:t>(</w:t>
+        <w:t>setJourneyResult(</w:t>
       </w:r>
       <w:proofErr w:type="gramEnd"/>
       <w:r>
@@ -2073,7 +2662,25 @@
           <w:szCs w:val="22"/>
           <w:lang w:val="en-US"/>
         </w:rPr>
-        <w:t>)” to declaratively render the map polylines.</w:t>
+        <w:t>)</w:t>
+      </w:r>
+      <w:r>
+        <w:rPr>
+          <w:rFonts w:ascii="Times New Roman" w:hAnsi="Times New Roman" w:cs="Times New Roman"/>
+          <w:sz w:val="22"/>
+          <w:szCs w:val="22"/>
+          <w:lang w:val="en-US"/>
+        </w:rPr>
+        <w:t>”</w:t>
+      </w:r>
+      <w:r>
+        <w:rPr>
+          <w:rFonts w:ascii="Times New Roman" w:hAnsi="Times New Roman" w:cs="Times New Roman"/>
+          <w:sz w:val="22"/>
+          <w:szCs w:val="22"/>
+          <w:lang w:val="en-US"/>
+        </w:rPr>
+        <w:t xml:space="preserve"> to declaratively render the map polylines.</w:t>
       </w:r>
     </w:p>
     <w:p>
@@ -2092,13 +2699,12 @@
         <w:keepNext/>
         <w:spacing w:line="240" w:lineRule="auto"/>
         <w:rPr>
-          <w:rFonts w:ascii="Times New Roman" w:hAnsi="Times New Roman" w:cs="Times New Roman"/>
-          <w:lang w:val="en-US"/>
-        </w:rPr>
-      </w:pPr>
-      <w:r>
-        <w:rPr>
-          <w:rFonts w:ascii="Times New Roman" w:hAnsi="Times New Roman" w:cs="Times New Roman"/>
+          <w:lang w:val="en-US"/>
+        </w:rPr>
+      </w:pPr>
+      <w:r>
+        <w:rPr>
+          <w:rFonts w:hint="eastAsia"/>
           <w:noProof/>
           <w:lang w:val="en-US"/>
         </w:rPr>
@@ -2143,66 +2749,22 @@
       <w:pPr>
         <w:pStyle w:val="Caption"/>
         <w:jc w:val="center"/>
-        <w:rPr>
-          <w:rFonts w:ascii="Times New Roman" w:hAnsi="Times New Roman" w:cs="Times New Roman"/>
-        </w:rPr>
-      </w:pPr>
-      <w:r>
-        <w:rPr>
-          <w:rFonts w:ascii="Times New Roman" w:hAnsi="Times New Roman" w:cs="Times New Roman"/>
-          <w:sz w:val="16"/>
-          <w:szCs w:val="16"/>
-        </w:rPr>
-        <w:t>Figure</w:t>
-      </w:r>
-      <w:r>
-        <w:rPr>
-          <w:rFonts w:ascii="Times New Roman" w:hAnsi="Times New Roman" w:cs="Times New Roman"/>
-        </w:rPr>
-        <w:t xml:space="preserve"> </w:t>
-      </w:r>
-      <w:r>
-        <w:rPr>
-          <w:rFonts w:ascii="Times New Roman" w:hAnsi="Times New Roman" w:cs="Times New Roman"/>
-        </w:rPr>
+      </w:pPr>
+      <w:r>
+        <w:t xml:space="preserve">Figure </w:t>
+      </w:r>
+      <w:r>
         <w:t>3.</w:t>
       </w:r>
-      <w:r>
-        <w:rPr>
-          <w:rFonts w:ascii="Times New Roman" w:hAnsi="Times New Roman" w:cs="Times New Roman"/>
-        </w:rPr>
-        <w:fldChar w:fldCharType="begin"/>
-      </w:r>
-      <w:r>
-        <w:rPr>
-          <w:rFonts w:ascii="Times New Roman" w:hAnsi="Times New Roman" w:cs="Times New Roman"/>
-        </w:rPr>
-        <w:instrText xml:space="preserve"> SEQ Figure \* ARABIC </w:instrText>
-      </w:r>
-      <w:r>
-        <w:rPr>
-          <w:rFonts w:ascii="Times New Roman" w:hAnsi="Times New Roman" w:cs="Times New Roman"/>
-        </w:rPr>
-        <w:fldChar w:fldCharType="separate"/>
-      </w:r>
-      <w:r>
-        <w:rPr>
-          <w:rFonts w:ascii="Times New Roman" w:hAnsi="Times New Roman" w:cs="Times New Roman"/>
-          <w:noProof/>
-        </w:rPr>
-        <w:t>6</w:t>
-      </w:r>
-      <w:r>
-        <w:rPr>
-          <w:rFonts w:ascii="Times New Roman" w:hAnsi="Times New Roman" w:cs="Times New Roman"/>
-          <w:noProof/>
-        </w:rPr>
-        <w:fldChar w:fldCharType="end"/>
-      </w:r>
-      <w:r>
-        <w:rPr>
-          <w:rFonts w:ascii="Times New Roman" w:hAnsi="Times New Roman" w:cs="Times New Roman"/>
-        </w:rPr>
+      <w:fldSimple w:instr=" SEQ Figure \* ARABIC ">
+        <w:r>
+          <w:rPr>
+            <w:noProof/>
+          </w:rPr>
+          <w:t>6</w:t>
+        </w:r>
+      </w:fldSimple>
+      <w:r>
         <w:t xml:space="preserve"> AI Chatbot</w:t>
       </w:r>
     </w:p>
@@ -2233,7 +2795,7 @@
       </w:r>
       <w:r>
         <w:rPr>
-          <w:rFonts w:ascii="Times New Roman" w:hAnsi="Times New Roman" w:cs="Times New Roman"/>
+          <w:rFonts w:ascii="Times New Roman" w:hAnsi="Times New Roman" w:cs="Times New Roman" w:hint="eastAsia"/>
           <w:sz w:val="22"/>
           <w:szCs w:val="22"/>
         </w:rPr>
@@ -2253,9 +2815,16 @@
           <w:sz w:val="22"/>
           <w:szCs w:val="22"/>
         </w:rPr>
-        <w:t>The user triggers “</w:t>
-      </w:r>
-      <w:proofErr w:type="spellStart"/>
+        <w:t xml:space="preserve">The user triggers </w:t>
+      </w:r>
+      <w:r>
+        <w:rPr>
+          <w:rFonts w:ascii="Times New Roman" w:hAnsi="Times New Roman" w:cs="Times New Roman"/>
+          <w:sz w:val="22"/>
+          <w:szCs w:val="22"/>
+        </w:rPr>
+        <w:t>“</w:t>
+      </w:r>
       <w:proofErr w:type="gramStart"/>
       <w:r>
         <w:rPr>
@@ -2263,16 +2832,7 @@
           <w:sz w:val="22"/>
           <w:szCs w:val="22"/>
         </w:rPr>
-        <w:t>submitMessage</w:t>
-      </w:r>
-      <w:proofErr w:type="spellEnd"/>
-      <w:r>
-        <w:rPr>
-          <w:rFonts w:ascii="Times New Roman" w:hAnsi="Times New Roman" w:cs="Times New Roman"/>
-          <w:sz w:val="22"/>
-          <w:szCs w:val="22"/>
-        </w:rPr>
-        <w:t>(</w:t>
+        <w:t>submitMessage(</w:t>
       </w:r>
       <w:proofErr w:type="gramEnd"/>
       <w:r>
@@ -2281,7 +2841,23 @@
           <w:sz w:val="22"/>
           <w:szCs w:val="22"/>
         </w:rPr>
-        <w:t xml:space="preserve">)”. </w:t>
+        <w:t>)</w:t>
+      </w:r>
+      <w:r>
+        <w:rPr>
+          <w:rFonts w:ascii="Times New Roman" w:hAnsi="Times New Roman" w:cs="Times New Roman"/>
+          <w:sz w:val="22"/>
+          <w:szCs w:val="22"/>
+        </w:rPr>
+        <w:t>”</w:t>
+      </w:r>
+      <w:r>
+        <w:rPr>
+          <w:rFonts w:ascii="Times New Roman" w:hAnsi="Times New Roman" w:cs="Times New Roman"/>
+          <w:sz w:val="22"/>
+          <w:szCs w:val="22"/>
+        </w:rPr>
+        <w:t xml:space="preserve">. </w:t>
       </w:r>
       <w:r>
         <w:rPr>
@@ -2306,35 +2882,72 @@
           <w:sz w:val="22"/>
           <w:szCs w:val="22"/>
         </w:rPr>
-        <w:t>Authorization Bearer” HTTP header via “_</w:t>
-      </w:r>
-      <w:proofErr w:type="spellStart"/>
-      <w:r>
-        <w:rPr>
-          <w:rFonts w:ascii="Times New Roman" w:hAnsi="Times New Roman" w:cs="Times New Roman"/>
-          <w:sz w:val="22"/>
-          <w:szCs w:val="22"/>
-        </w:rPr>
-        <w:t>require_auth</w:t>
-      </w:r>
-      <w:proofErr w:type="spellEnd"/>
-      <w:r>
-        <w:rPr>
-          <w:rFonts w:ascii="Times New Roman" w:hAnsi="Times New Roman" w:cs="Times New Roman"/>
-          <w:sz w:val="22"/>
-          <w:szCs w:val="22"/>
-        </w:rPr>
-        <w:t>()”.</w:t>
-      </w:r>
-      <w:r>
-        <w:rPr>
-          <w:rFonts w:ascii="Times New Roman" w:hAnsi="Times New Roman" w:cs="Times New Roman"/>
-          <w:sz w:val="22"/>
-          <w:szCs w:val="22"/>
-        </w:rPr>
-        <w:t>The “</w:t>
-      </w:r>
-      <w:proofErr w:type="spellStart"/>
+        <w:t>Authorization Bearer</w:t>
+      </w:r>
+      <w:r>
+        <w:rPr>
+          <w:rFonts w:ascii="Times New Roman" w:hAnsi="Times New Roman" w:cs="Times New Roman"/>
+          <w:sz w:val="22"/>
+          <w:szCs w:val="22"/>
+        </w:rPr>
+        <w:t>”</w:t>
+      </w:r>
+      <w:r>
+        <w:rPr>
+          <w:rFonts w:ascii="Times New Roman" w:hAnsi="Times New Roman" w:cs="Times New Roman"/>
+          <w:sz w:val="22"/>
+          <w:szCs w:val="22"/>
+        </w:rPr>
+        <w:t xml:space="preserve"> HTTP header via </w:t>
+      </w:r>
+      <w:r>
+        <w:rPr>
+          <w:rFonts w:ascii="Times New Roman" w:hAnsi="Times New Roman" w:cs="Times New Roman"/>
+          <w:sz w:val="22"/>
+          <w:szCs w:val="22"/>
+        </w:rPr>
+        <w:t>“</w:t>
+      </w:r>
+      <w:r>
+        <w:rPr>
+          <w:rFonts w:ascii="Times New Roman" w:hAnsi="Times New Roman" w:cs="Times New Roman"/>
+          <w:sz w:val="22"/>
+          <w:szCs w:val="22"/>
+        </w:rPr>
+        <w:t>_require_auth()</w:t>
+      </w:r>
+      <w:r>
+        <w:rPr>
+          <w:rFonts w:ascii="Times New Roman" w:hAnsi="Times New Roman" w:cs="Times New Roman"/>
+          <w:sz w:val="22"/>
+          <w:szCs w:val="22"/>
+        </w:rPr>
+        <w:t>”</w:t>
+      </w:r>
+      <w:r>
+        <w:rPr>
+          <w:rFonts w:ascii="Times New Roman" w:hAnsi="Times New Roman" w:cs="Times New Roman"/>
+          <w:sz w:val="22"/>
+          <w:szCs w:val="22"/>
+        </w:rPr>
+        <w:t>.</w:t>
+      </w:r>
+      <w:r>
+        <w:rPr>
+          <w:rFonts w:ascii="Times New Roman" w:hAnsi="Times New Roman" w:cs="Times New Roman"/>
+          <w:sz w:val="22"/>
+          <w:szCs w:val="22"/>
+        </w:rPr>
+        <w:t xml:space="preserve">The </w:t>
+      </w:r>
+      <w:r>
+        <w:rPr>
+          <w:rFonts w:ascii="Times New Roman" w:hAnsi="Times New Roman" w:cs="Times New Roman"/>
+          <w:sz w:val="22"/>
+          <w:szCs w:val="22"/>
+        </w:rPr>
+        <w:t>“</w:t>
+      </w:r>
       <w:r>
         <w:rPr>
           <w:rFonts w:ascii="Times New Roman" w:hAnsi="Times New Roman" w:cs="Times New Roman"/>
@@ -2343,86 +2956,118 @@
         </w:rPr>
         <w:t>chatService</w:t>
       </w:r>
-      <w:proofErr w:type="spellEnd"/>
-      <w:r>
-        <w:rPr>
-          <w:rFonts w:ascii="Times New Roman" w:hAnsi="Times New Roman" w:cs="Times New Roman"/>
-          <w:sz w:val="22"/>
-          <w:szCs w:val="22"/>
-        </w:rPr>
-        <w:t xml:space="preserve">” executes inline </w:t>
-      </w:r>
-      <w:proofErr w:type="spellStart"/>
-      <w:r>
-        <w:rPr>
-          <w:rFonts w:ascii="Times New Roman" w:hAnsi="Times New Roman" w:cs="Times New Roman"/>
-          <w:sz w:val="22"/>
-          <w:szCs w:val="22"/>
-        </w:rPr>
-        <w:t>SQLAlchemy</w:t>
-      </w:r>
-      <w:proofErr w:type="spellEnd"/>
-      <w:r>
-        <w:rPr>
-          <w:rFonts w:ascii="Times New Roman" w:hAnsi="Times New Roman" w:cs="Times New Roman"/>
-          <w:sz w:val="22"/>
-          <w:szCs w:val="22"/>
-        </w:rPr>
-        <w:t xml:space="preserve"> database operations to ensure session continuity, and then passes context </w:t>
-      </w:r>
-      <w:r>
-        <w:rPr>
-          <w:rFonts w:ascii="Times New Roman" w:hAnsi="Times New Roman" w:cs="Times New Roman"/>
-          <w:sz w:val="22"/>
-          <w:szCs w:val="22"/>
-        </w:rPr>
-        <w:t>to the “</w:t>
-      </w:r>
-      <w:proofErr w:type="spellStart"/>
-      <w:r>
-        <w:rPr>
-          <w:rFonts w:ascii="Times New Roman" w:hAnsi="Times New Roman" w:cs="Times New Roman"/>
-          <w:sz w:val="22"/>
-          <w:szCs w:val="22"/>
-        </w:rPr>
-        <w:t>llmClient</w:t>
-      </w:r>
-      <w:proofErr w:type="spellEnd"/>
-      <w:r>
-        <w:rPr>
-          <w:rFonts w:ascii="Times New Roman" w:hAnsi="Times New Roman" w:cs="Times New Roman"/>
-          <w:sz w:val="22"/>
-          <w:szCs w:val="22"/>
-        </w:rPr>
-        <w:t xml:space="preserve">: </w:t>
-      </w:r>
-      <w:proofErr w:type="spellStart"/>
-      <w:r>
-        <w:rPr>
-          <w:rFonts w:ascii="Times New Roman" w:hAnsi="Times New Roman" w:cs="Times New Roman"/>
-          <w:sz w:val="22"/>
-          <w:szCs w:val="22"/>
-        </w:rPr>
-        <w:t>LangChainLLM</w:t>
-      </w:r>
-      <w:proofErr w:type="spellEnd"/>
-      <w:r>
-        <w:rPr>
-          <w:rFonts w:ascii="Times New Roman" w:hAnsi="Times New Roman" w:cs="Times New Roman"/>
-          <w:sz w:val="22"/>
-          <w:szCs w:val="22"/>
-        </w:rPr>
-        <w:t xml:space="preserve">” via “invoke()”, </w:t>
-      </w:r>
-      <w:r>
-        <w:rPr>
-          <w:rFonts w:ascii="Times New Roman" w:hAnsi="Times New Roman" w:cs="Times New Roman"/>
-          <w:sz w:val="22"/>
-          <w:szCs w:val="22"/>
-        </w:rPr>
-        <w:t>which internally utilizes “</w:t>
-      </w:r>
-      <w:proofErr w:type="spellStart"/>
+      <w:r>
+        <w:rPr>
+          <w:rFonts w:ascii="Times New Roman" w:hAnsi="Times New Roman" w:cs="Times New Roman"/>
+          <w:sz w:val="22"/>
+          <w:szCs w:val="22"/>
+        </w:rPr>
+        <w:t>”</w:t>
+      </w:r>
+      <w:r>
+        <w:rPr>
+          <w:rFonts w:ascii="Times New Roman" w:hAnsi="Times New Roman" w:cs="Times New Roman"/>
+          <w:sz w:val="22"/>
+          <w:szCs w:val="22"/>
+        </w:rPr>
+        <w:t xml:space="preserve"> executes inline SQLAlchemy database operations to ensure session continuity, and then passes context</w:t>
+      </w:r>
+      <w:r>
+        <w:rPr>
+          <w:rFonts w:ascii="Times New Roman" w:hAnsi="Times New Roman" w:cs="Times New Roman"/>
+          <w:sz w:val="22"/>
+          <w:szCs w:val="22"/>
+        </w:rPr>
+        <w:t xml:space="preserve"> </w:t>
+      </w:r>
+      <w:r>
+        <w:rPr>
+          <w:rFonts w:ascii="Times New Roman" w:hAnsi="Times New Roman" w:cs="Times New Roman"/>
+          <w:sz w:val="22"/>
+          <w:szCs w:val="22"/>
+        </w:rPr>
+        <w:t xml:space="preserve">to the </w:t>
+      </w:r>
+      <w:r>
+        <w:rPr>
+          <w:rFonts w:ascii="Times New Roman" w:hAnsi="Times New Roman" w:cs="Times New Roman"/>
+          <w:sz w:val="22"/>
+          <w:szCs w:val="22"/>
+        </w:rPr>
+        <w:t>“</w:t>
+      </w:r>
+      <w:r>
+        <w:rPr>
+          <w:rFonts w:ascii="Times New Roman" w:hAnsi="Times New Roman" w:cs="Times New Roman"/>
+          <w:sz w:val="22"/>
+          <w:szCs w:val="22"/>
+        </w:rPr>
+        <w:t>llmClient: LangChainLLM</w:t>
+      </w:r>
+      <w:r>
+        <w:rPr>
+          <w:rFonts w:ascii="Times New Roman" w:hAnsi="Times New Roman" w:cs="Times New Roman"/>
+          <w:sz w:val="22"/>
+          <w:szCs w:val="22"/>
+        </w:rPr>
+        <w:t>”</w:t>
+      </w:r>
+      <w:r>
+        <w:rPr>
+          <w:rFonts w:ascii="Times New Roman" w:hAnsi="Times New Roman" w:cs="Times New Roman"/>
+          <w:sz w:val="22"/>
+          <w:szCs w:val="22"/>
+        </w:rPr>
+        <w:t xml:space="preserve"> via </w:t>
+      </w:r>
+      <w:r>
+        <w:rPr>
+          <w:rFonts w:ascii="Times New Roman" w:hAnsi="Times New Roman" w:cs="Times New Roman"/>
+          <w:sz w:val="22"/>
+          <w:szCs w:val="22"/>
+        </w:rPr>
+        <w:t>“</w:t>
+      </w:r>
+      <w:r>
+        <w:rPr>
+          <w:rFonts w:ascii="Times New Roman" w:hAnsi="Times New Roman" w:cs="Times New Roman"/>
+          <w:sz w:val="22"/>
+          <w:szCs w:val="22"/>
+        </w:rPr>
+        <w:t>invoke()</w:t>
+      </w:r>
+      <w:r>
+        <w:rPr>
+          <w:rFonts w:ascii="Times New Roman" w:hAnsi="Times New Roman" w:cs="Times New Roman"/>
+          <w:sz w:val="22"/>
+          <w:szCs w:val="22"/>
+        </w:rPr>
+        <w:t>”</w:t>
+      </w:r>
+      <w:r>
+        <w:rPr>
+          <w:rFonts w:ascii="Times New Roman" w:hAnsi="Times New Roman" w:cs="Times New Roman"/>
+          <w:sz w:val="22"/>
+          <w:szCs w:val="22"/>
+        </w:rPr>
+        <w:t xml:space="preserve">, </w:t>
+      </w:r>
+      <w:r>
+        <w:rPr>
+          <w:rFonts w:ascii="Times New Roman" w:hAnsi="Times New Roman" w:cs="Times New Roman"/>
+          <w:sz w:val="22"/>
+          <w:szCs w:val="22"/>
+        </w:rPr>
+        <w:t xml:space="preserve">which internally utilizes </w:t>
+      </w:r>
+      <w:r>
+        <w:rPr>
+          <w:rFonts w:ascii="Times New Roman" w:hAnsi="Times New Roman" w:cs="Times New Roman"/>
+          <w:sz w:val="22"/>
+          <w:szCs w:val="22"/>
+        </w:rPr>
+        <w:t>“</w:t>
+      </w:r>
       <w:r>
         <w:rPr>
           <w:rFonts w:ascii="Times New Roman" w:hAnsi="Times New Roman" w:cs="Times New Roman"/>
@@ -2431,47 +3076,67 @@
         </w:rPr>
         <w:t>SQLChatMessageHistory</w:t>
       </w:r>
-      <w:proofErr w:type="spellEnd"/>
-      <w:r>
-        <w:rPr>
-          <w:rFonts w:ascii="Times New Roman" w:hAnsi="Times New Roman" w:cs="Times New Roman"/>
-          <w:sz w:val="22"/>
-          <w:szCs w:val="22"/>
-        </w:rPr>
-        <w:t xml:space="preserve">” to seamlessly save and load dialogue state, </w:t>
-      </w:r>
-      <w:r>
-        <w:rPr>
-          <w:rFonts w:ascii="Times New Roman" w:hAnsi="Times New Roman" w:cs="Times New Roman"/>
-          <w:sz w:val="22"/>
-          <w:szCs w:val="22"/>
-        </w:rPr>
-        <w:t>ending with the UI component updating state via “</w:t>
-      </w:r>
-      <w:proofErr w:type="spellStart"/>
-      <w:r>
-        <w:rPr>
-          <w:rFonts w:ascii="Times New Roman" w:hAnsi="Times New Roman" w:cs="Times New Roman"/>
-          <w:sz w:val="22"/>
-          <w:szCs w:val="22"/>
-        </w:rPr>
-        <w:t>setMessages</w:t>
-      </w:r>
-      <w:proofErr w:type="spellEnd"/>
-      <w:r>
-        <w:rPr>
-          <w:rFonts w:ascii="Times New Roman" w:hAnsi="Times New Roman" w:cs="Times New Roman"/>
-          <w:sz w:val="22"/>
-          <w:szCs w:val="22"/>
-        </w:rPr>
-        <w:t>()”.</w:t>
+      <w:r>
+        <w:rPr>
+          <w:rFonts w:ascii="Times New Roman" w:hAnsi="Times New Roman" w:cs="Times New Roman"/>
+          <w:sz w:val="22"/>
+          <w:szCs w:val="22"/>
+        </w:rPr>
+        <w:t>”</w:t>
+      </w:r>
+      <w:r>
+        <w:rPr>
+          <w:rFonts w:ascii="Times New Roman" w:hAnsi="Times New Roman" w:cs="Times New Roman"/>
+          <w:sz w:val="22"/>
+          <w:szCs w:val="22"/>
+        </w:rPr>
+        <w:t xml:space="preserve"> to seamlessly save and load dialogue state, </w:t>
+      </w:r>
+      <w:r>
+        <w:rPr>
+          <w:rFonts w:ascii="Times New Roman" w:hAnsi="Times New Roman" w:cs="Times New Roman"/>
+          <w:sz w:val="22"/>
+          <w:szCs w:val="22"/>
+        </w:rPr>
+        <w:t xml:space="preserve">ending with the UI component updating state via </w:t>
+      </w:r>
+      <w:r>
+        <w:rPr>
+          <w:rFonts w:ascii="Times New Roman" w:hAnsi="Times New Roman" w:cs="Times New Roman"/>
+          <w:sz w:val="22"/>
+          <w:szCs w:val="22"/>
+        </w:rPr>
+        <w:t>“</w:t>
+      </w:r>
+      <w:r>
+        <w:rPr>
+          <w:rFonts w:ascii="Times New Roman" w:hAnsi="Times New Roman" w:cs="Times New Roman"/>
+          <w:sz w:val="22"/>
+          <w:szCs w:val="22"/>
+        </w:rPr>
+        <w:t>setMessages()</w:t>
+      </w:r>
+      <w:r>
+        <w:rPr>
+          <w:rFonts w:ascii="Times New Roman" w:hAnsi="Times New Roman" w:cs="Times New Roman"/>
+          <w:sz w:val="22"/>
+          <w:szCs w:val="22"/>
+        </w:rPr>
+        <w:t>”</w:t>
+      </w:r>
+      <w:r>
+        <w:rPr>
+          <w:rFonts w:ascii="Times New Roman" w:hAnsi="Times New Roman" w:cs="Times New Roman"/>
+          <w:sz w:val="22"/>
+          <w:szCs w:val="22"/>
+        </w:rPr>
+        <w:t>.</w:t>
       </w:r>
     </w:p>
     <w:p>
       <w:pPr>
         <w:spacing w:line="240" w:lineRule="auto"/>
         <w:rPr>
-          <w:rFonts w:ascii="Times New Roman" w:hAnsi="Times New Roman" w:cs="Times New Roman"/>
           <w:lang w:val="en-US"/>
         </w:rPr>
       </w:pPr>
@@ -2479,19 +3144,16 @@
     <w:p>
       <w:pPr>
         <w:keepNext/>
-        <w:rPr>
-          <w:rFonts w:ascii="Times New Roman" w:hAnsi="Times New Roman" w:cs="Times New Roman"/>
-        </w:rPr>
-      </w:pPr>
-      <w:r>
-        <w:rPr>
-          <w:rFonts w:ascii="Times New Roman" w:hAnsi="Times New Roman" w:cs="Times New Roman"/>
+      </w:pPr>
+      <w:r>
+        <w:rPr>
+          <w:rFonts w:hint="eastAsia"/>
           <w:noProof/>
         </w:rPr>
         <w:drawing>
-          <wp:inline distT="0" distB="0" distL="0" distR="0" wp14:anchorId="280CC7B8" wp14:editId="0C87DEBD">
-            <wp:extent cx="5731510" cy="2225675"/>
-            <wp:effectExtent l="0" t="0" r="0" b="0"/>
+          <wp:inline distT="0" distB="0" distL="0" distR="0" wp14:anchorId="280CC7B8" wp14:editId="76F43A0E">
+            <wp:extent cx="5731510" cy="2219088"/>
+            <wp:effectExtent l="0" t="0" r="0" b="3810"/>
             <wp:docPr id="317334160" name="Picture 14"/>
             <wp:cNvGraphicFramePr>
               <a:graphicFrameLocks xmlns:a="http://schemas.openxmlformats.org/drawingml/2006/main" noChangeAspect="1"/>
@@ -2500,7 +3162,7 @@
               <a:graphicData uri="http://schemas.openxmlformats.org/drawingml/2006/picture">
                 <pic:pic xmlns:pic="http://schemas.openxmlformats.org/drawingml/2006/picture">
                   <pic:nvPicPr>
-                    <pic:cNvPr id="317334160" name="Picture 317334160"/>
+                    <pic:cNvPr id="317334160" name="Picture 14"/>
                     <pic:cNvPicPr/>
                   </pic:nvPicPr>
                   <pic:blipFill>
@@ -2512,7 +3174,7 @@
                   <pic:spPr>
                     <a:xfrm>
                       <a:off x="0" y="0"/>
-                      <a:ext cx="5731510" cy="2225675"/>
+                      <a:ext cx="5731510" cy="2219088"/>
                     </a:xfrm>
                     <a:prstGeom prst="rect">
                       <a:avLst/>
@@ -2530,81 +3192,37 @@
         <w:pStyle w:val="Caption"/>
         <w:jc w:val="center"/>
         <w:rPr>
-          <w:rFonts w:ascii="Times New Roman" w:hAnsi="Times New Roman" w:cs="Times New Roman"/>
-          <w:lang w:val="en-US"/>
-        </w:rPr>
-      </w:pPr>
-      <w:r>
-        <w:rPr>
-          <w:rFonts w:ascii="Times New Roman" w:hAnsi="Times New Roman" w:cs="Times New Roman"/>
-        </w:rPr>
+          <w:lang w:val="en-US"/>
+        </w:rPr>
+      </w:pPr>
+      <w:r>
         <w:t xml:space="preserve">Figure </w:t>
       </w:r>
       <w:r>
-        <w:rPr>
-          <w:rFonts w:ascii="Times New Roman" w:hAnsi="Times New Roman" w:cs="Times New Roman"/>
-        </w:rPr>
         <w:t>3.</w:t>
       </w:r>
-      <w:r>
-        <w:rPr>
-          <w:rFonts w:ascii="Times New Roman" w:hAnsi="Times New Roman" w:cs="Times New Roman"/>
-        </w:rPr>
-        <w:fldChar w:fldCharType="begin"/>
-      </w:r>
-      <w:r>
-        <w:rPr>
-          <w:rFonts w:ascii="Times New Roman" w:hAnsi="Times New Roman" w:cs="Times New Roman"/>
-        </w:rPr>
-        <w:instrText xml:space="preserve"> SEQ Figure \* ARABIC </w:instrText>
-      </w:r>
-      <w:r>
-        <w:rPr>
-          <w:rFonts w:ascii="Times New Roman" w:hAnsi="Times New Roman" w:cs="Times New Roman"/>
-        </w:rPr>
-        <w:fldChar w:fldCharType="separate"/>
-      </w:r>
-      <w:r>
-        <w:rPr>
-          <w:rFonts w:ascii="Times New Roman" w:hAnsi="Times New Roman" w:cs="Times New Roman"/>
-          <w:noProof/>
-        </w:rPr>
-        <w:t>7</w:t>
-      </w:r>
-      <w:r>
-        <w:rPr>
-          <w:rFonts w:ascii="Times New Roman" w:hAnsi="Times New Roman" w:cs="Times New Roman"/>
-          <w:noProof/>
-        </w:rPr>
-        <w:fldChar w:fldCharType="end"/>
-      </w:r>
-      <w:r>
-        <w:rPr>
-          <w:rFonts w:ascii="Times New Roman" w:hAnsi="Times New Roman" w:cs="Times New Roman"/>
-        </w:rPr>
-        <w:t xml:space="preserve"> Bike</w:t>
-      </w:r>
-      <w:r>
-        <w:rPr>
-          <w:rFonts w:ascii="Times New Roman" w:hAnsi="Times New Roman" w:cs="Times New Roman"/>
-          <w:lang w:val="en-US"/>
+      <w:fldSimple w:instr=" SEQ Figure \* ARABIC ">
+        <w:r>
+          <w:rPr>
+            <w:noProof/>
+          </w:rPr>
+          <w:t>7</w:t>
+        </w:r>
+      </w:fldSimple>
+      <w:r>
+        <w:rPr>
+          <w:rFonts w:hint="eastAsia"/>
         </w:rPr>
         <w:t xml:space="preserve"> </w:t>
       </w:r>
       <w:r>
-        <w:rPr>
-          <w:rFonts w:ascii="Times New Roman" w:hAnsi="Times New Roman" w:cs="Times New Roman"/>
-          <w:sz w:val="16"/>
-          <w:szCs w:val="16"/>
-        </w:rPr>
-        <w:t>Availability</w:t>
-      </w:r>
-      <w:r>
-        <w:rPr>
-          <w:rFonts w:ascii="Times New Roman" w:hAnsi="Times New Roman" w:cs="Times New Roman"/>
-          <w:lang w:val="en-US"/>
-        </w:rPr>
-        <w:t xml:space="preserve"> Prediction</w:t>
+        <w:t>Bike</w:t>
+      </w:r>
+      <w:r>
+        <w:rPr>
+          <w:lang w:val="en-US"/>
+        </w:rPr>
+        <w:t xml:space="preserve"> Availability Prediction</w:t>
       </w:r>
     </w:p>
     <w:p>
@@ -2633,7 +3251,7 @@
       </w:r>
       <w:r>
         <w:rPr>
-          <w:rFonts w:ascii="Times New Roman" w:hAnsi="Times New Roman" w:cs="Times New Roman"/>
+          <w:rFonts w:ascii="Times New Roman" w:hAnsi="Times New Roman" w:cs="Times New Roman" w:hint="eastAsia"/>
           <w:sz w:val="22"/>
           <w:szCs w:val="22"/>
         </w:rPr>
@@ -2653,9 +3271,16 @@
           <w:sz w:val="22"/>
           <w:szCs w:val="22"/>
         </w:rPr>
-        <w:t>Outlines the Machine Learning inference loop triggered by “</w:t>
-      </w:r>
-      <w:proofErr w:type="spellStart"/>
+        <w:t xml:space="preserve">Outlines the Machine Learning inference loop triggered by </w:t>
+      </w:r>
+      <w:r>
+        <w:rPr>
+          <w:rFonts w:ascii="Times New Roman" w:hAnsi="Times New Roman" w:cs="Times New Roman"/>
+          <w:sz w:val="22"/>
+          <w:szCs w:val="22"/>
+        </w:rPr>
+        <w:t>“</w:t>
+      </w:r>
       <w:proofErr w:type="gramStart"/>
       <w:r>
         <w:rPr>
@@ -2663,16 +3288,7 @@
           <w:sz w:val="22"/>
           <w:szCs w:val="22"/>
         </w:rPr>
-        <w:t>clickStationMarker</w:t>
-      </w:r>
-      <w:proofErr w:type="spellEnd"/>
-      <w:r>
-        <w:rPr>
-          <w:rFonts w:ascii="Times New Roman" w:hAnsi="Times New Roman" w:cs="Times New Roman"/>
-          <w:sz w:val="22"/>
-          <w:szCs w:val="22"/>
-        </w:rPr>
-        <w:t>(</w:t>
+        <w:t>clickStationMarker(</w:t>
       </w:r>
       <w:proofErr w:type="gramEnd"/>
       <w:r>
@@ -2681,9 +3297,32 @@
           <w:sz w:val="22"/>
           <w:szCs w:val="22"/>
         </w:rPr>
-        <w:t>)”. The “</w:t>
-      </w:r>
-      <w:proofErr w:type="spellStart"/>
+        <w:t>)</w:t>
+      </w:r>
+      <w:r>
+        <w:rPr>
+          <w:rFonts w:ascii="Times New Roman" w:hAnsi="Times New Roman" w:cs="Times New Roman"/>
+          <w:sz w:val="22"/>
+          <w:szCs w:val="22"/>
+        </w:rPr>
+        <w:t>”</w:t>
+      </w:r>
+      <w:r>
+        <w:rPr>
+          <w:rFonts w:ascii="Times New Roman" w:hAnsi="Times New Roman" w:cs="Times New Roman"/>
+          <w:sz w:val="22"/>
+          <w:szCs w:val="22"/>
+        </w:rPr>
+        <w:t xml:space="preserve">. The </w:t>
+      </w:r>
+      <w:r>
+        <w:rPr>
+          <w:rFonts w:ascii="Times New Roman" w:hAnsi="Times New Roman" w:cs="Times New Roman"/>
+          <w:sz w:val="22"/>
+          <w:szCs w:val="22"/>
+        </w:rPr>
+        <w:t>“</w:t>
+      </w:r>
       <w:r>
         <w:rPr>
           <w:rFonts w:ascii="Times New Roman" w:hAnsi="Times New Roman" w:cs="Times New Roman"/>
@@ -2692,14 +3331,21 @@
         </w:rPr>
         <w:t>predictionService</w:t>
       </w:r>
-      <w:proofErr w:type="spellEnd"/>
-      <w:r>
-        <w:rPr>
-          <w:rFonts w:ascii="Times New Roman" w:hAnsi="Times New Roman" w:cs="Times New Roman"/>
-          <w:sz w:val="22"/>
-          <w:szCs w:val="22"/>
-        </w:rPr>
-        <w:t xml:space="preserve">” queries </w:t>
+      <w:r>
+        <w:rPr>
+          <w:rFonts w:ascii="Times New Roman" w:hAnsi="Times New Roman" w:cs="Times New Roman"/>
+          <w:sz w:val="22"/>
+          <w:szCs w:val="22"/>
+        </w:rPr>
+        <w:t>”</w:t>
+      </w:r>
+      <w:r>
+        <w:rPr>
+          <w:rFonts w:ascii="Times New Roman" w:hAnsi="Times New Roman" w:cs="Times New Roman"/>
+          <w:sz w:val="22"/>
+          <w:szCs w:val="22"/>
+        </w:rPr>
+        <w:t xml:space="preserve"> queries </w:t>
       </w:r>
       <w:r>
         <w:rPr>
@@ -2718,23 +3364,13 @@
         </w:rPr>
         <w:t>“</w:t>
       </w:r>
-      <w:proofErr w:type="spellStart"/>
-      <w:r>
-        <w:rPr>
-          <w:rFonts w:ascii="Times New Roman" w:hAnsi="Times New Roman" w:cs="Times New Roman"/>
-          <w:sz w:val="22"/>
-          <w:szCs w:val="22"/>
-        </w:rPr>
-        <w:t>stationRecord</w:t>
-      </w:r>
-      <w:proofErr w:type="spellEnd"/>
-      <w:r>
-        <w:rPr>
-          <w:rFonts w:ascii="Times New Roman" w:hAnsi="Times New Roman" w:cs="Times New Roman"/>
-          <w:sz w:val="22"/>
-          <w:szCs w:val="22"/>
-        </w:rPr>
-        <w:t>: Station</w:t>
+      <w:r>
+        <w:rPr>
+          <w:rFonts w:ascii="Times New Roman" w:hAnsi="Times New Roman" w:cs="Times New Roman"/>
+          <w:sz w:val="22"/>
+          <w:szCs w:val="22"/>
+        </w:rPr>
+        <w:t>stationRecord: Station</w:t>
       </w:r>
       <w:r>
         <w:rPr>
@@ -2762,34 +3398,14 @@
         </w:rPr>
         <w:t>“</w:t>
       </w:r>
-      <w:proofErr w:type="spellStart"/>
-      <w:r>
-        <w:rPr>
-          <w:rFonts w:ascii="Times New Roman" w:hAnsi="Times New Roman" w:cs="Times New Roman"/>
-          <w:sz w:val="22"/>
-          <w:szCs w:val="22"/>
-        </w:rPr>
-        <w:t>weatherRecord</w:t>
-      </w:r>
-      <w:proofErr w:type="spellEnd"/>
-      <w:r>
-        <w:rPr>
-          <w:rFonts w:ascii="Times New Roman" w:hAnsi="Times New Roman" w:cs="Times New Roman"/>
-          <w:sz w:val="22"/>
-          <w:szCs w:val="22"/>
-        </w:rPr>
-        <w:t xml:space="preserve">: </w:t>
-      </w:r>
-      <w:proofErr w:type="spellStart"/>
-      <w:r>
-        <w:rPr>
-          <w:rFonts w:ascii="Times New Roman" w:hAnsi="Times New Roman" w:cs="Times New Roman"/>
-          <w:sz w:val="22"/>
-          <w:szCs w:val="22"/>
-        </w:rPr>
-        <w:t>WeatherForecast</w:t>
-      </w:r>
-      <w:proofErr w:type="spellEnd"/>
+      <w:r>
+        <w:rPr>
+          <w:rFonts w:ascii="Times New Roman" w:hAnsi="Times New Roman" w:cs="Times New Roman"/>
+          <w:sz w:val="22"/>
+          <w:szCs w:val="22"/>
+        </w:rPr>
+        <w:t>weatherRecord: WeatherForecast</w:t>
+      </w:r>
       <w:r>
         <w:rPr>
           <w:rFonts w:ascii="Times New Roman" w:hAnsi="Times New Roman" w:cs="Times New Roman"/>
@@ -2805,7 +3421,23 @@
           <w:sz w:val="22"/>
           <w:szCs w:val="22"/>
         </w:rPr>
-        <w:t xml:space="preserve"> for future meteorological data. It executes an </w:t>
+        <w:t xml:space="preserve"> for future meteorological data.</w:t>
+      </w:r>
+      <w:r>
+        <w:rPr>
+          <w:rFonts w:ascii="Times New Roman" w:hAnsi="Times New Roman" w:cs="Times New Roman" w:hint="eastAsia"/>
+          <w:sz w:val="22"/>
+          <w:szCs w:val="22"/>
+        </w:rPr>
+        <w:t xml:space="preserve"> </w:t>
+      </w:r>
+      <w:r>
+        <w:rPr>
+          <w:rFonts w:ascii="Times New Roman" w:hAnsi="Times New Roman" w:cs="Times New Roman"/>
+          <w:sz w:val="22"/>
+          <w:szCs w:val="22"/>
+        </w:rPr>
+        <w:t xml:space="preserve">It executes an </w:t>
       </w:r>
       <w:r>
         <w:rPr>
@@ -2814,51 +3446,95 @@
           <w:szCs w:val="22"/>
         </w:rPr>
         <w:lastRenderedPageBreak/>
-        <w:t>inline process to format a Pandas dataframe feature array (combining time, weather, and station metrics)</w:t>
-      </w:r>
-      <w:r>
-        <w:rPr>
-          <w:rFonts w:ascii="Times New Roman" w:hAnsi="Times New Roman" w:cs="Times New Roman"/>
-          <w:sz w:val="22"/>
-          <w:szCs w:val="22"/>
-        </w:rPr>
-        <w:t xml:space="preserve"> before passing it to the “</w:t>
-      </w:r>
-      <w:proofErr w:type="spellStart"/>
-      <w:r>
-        <w:rPr>
-          <w:rFonts w:ascii="Times New Roman" w:hAnsi="Times New Roman" w:cs="Times New Roman"/>
-          <w:sz w:val="22"/>
-          <w:szCs w:val="22"/>
-        </w:rPr>
-        <w:t>rfModel</w:t>
-      </w:r>
-      <w:proofErr w:type="spellEnd"/>
-      <w:r>
-        <w:rPr>
-          <w:rFonts w:ascii="Times New Roman" w:hAnsi="Times New Roman" w:cs="Times New Roman"/>
-          <w:sz w:val="22"/>
-          <w:szCs w:val="22"/>
-        </w:rPr>
-        <w:t xml:space="preserve">: </w:t>
-      </w:r>
-      <w:proofErr w:type="spellStart"/>
-      <w:r>
-        <w:rPr>
-          <w:rFonts w:ascii="Times New Roman" w:hAnsi="Times New Roman" w:cs="Times New Roman"/>
-          <w:sz w:val="22"/>
-          <w:szCs w:val="22"/>
-        </w:rPr>
-        <w:t>RandomForestRegressor</w:t>
-      </w:r>
-      <w:proofErr w:type="spellEnd"/>
-      <w:r>
-        <w:rPr>
-          <w:rFonts w:ascii="Times New Roman" w:hAnsi="Times New Roman" w:cs="Times New Roman"/>
-          <w:sz w:val="22"/>
-          <w:szCs w:val="22"/>
-        </w:rPr>
-        <w:t>” instance's “</w:t>
+        <w:t xml:space="preserve">inline process to format a Pandas </w:t>
+      </w:r>
+      <w:r>
+        <w:rPr>
+          <w:rFonts w:ascii="Times New Roman" w:hAnsi="Times New Roman" w:cs="Times New Roman"/>
+          <w:sz w:val="22"/>
+          <w:szCs w:val="22"/>
+        </w:rPr>
+        <w:t>d</w:t>
+      </w:r>
+      <w:r>
+        <w:rPr>
+          <w:rFonts w:ascii="Times New Roman" w:hAnsi="Times New Roman" w:cs="Times New Roman"/>
+          <w:sz w:val="22"/>
+          <w:szCs w:val="22"/>
+        </w:rPr>
+        <w:t>ata</w:t>
+      </w:r>
+      <w:r>
+        <w:rPr>
+          <w:rFonts w:ascii="Times New Roman" w:hAnsi="Times New Roman" w:cs="Times New Roman"/>
+          <w:sz w:val="22"/>
+          <w:szCs w:val="22"/>
+        </w:rPr>
+        <w:t>f</w:t>
+      </w:r>
+      <w:r>
+        <w:rPr>
+          <w:rFonts w:ascii="Times New Roman" w:hAnsi="Times New Roman" w:cs="Times New Roman"/>
+          <w:sz w:val="22"/>
+          <w:szCs w:val="22"/>
+        </w:rPr>
+        <w:t>rame feature array (combining time, weather, and station metrics)</w:t>
+      </w:r>
+      <w:r>
+        <w:rPr>
+          <w:rFonts w:ascii="Times New Roman" w:hAnsi="Times New Roman" w:cs="Times New Roman"/>
+          <w:sz w:val="22"/>
+          <w:szCs w:val="22"/>
+        </w:rPr>
+        <w:t xml:space="preserve"> before passing it to the </w:t>
+      </w:r>
+      <w:r>
+        <w:rPr>
+          <w:rFonts w:ascii="Times New Roman" w:hAnsi="Times New Roman" w:cs="Times New Roman"/>
+          <w:sz w:val="22"/>
+          <w:szCs w:val="22"/>
+        </w:rPr>
+        <w:t>“</w:t>
+      </w:r>
+      <w:r>
+        <w:rPr>
+          <w:rFonts w:ascii="Times New Roman" w:hAnsi="Times New Roman" w:cs="Times New Roman"/>
+          <w:sz w:val="22"/>
+          <w:szCs w:val="22"/>
+        </w:rPr>
+        <w:t xml:space="preserve">rfModel: </w:t>
+      </w:r>
+      <w:r>
+        <w:rPr>
+          <w:rFonts w:ascii="Times New Roman" w:hAnsi="Times New Roman" w:cs="Times New Roman"/>
+          <w:sz w:val="22"/>
+          <w:szCs w:val="22"/>
+        </w:rPr>
+        <w:t>DecisionTree</w:t>
+      </w:r>
+      <w:r>
+        <w:rPr>
+          <w:rFonts w:ascii="Times New Roman" w:hAnsi="Times New Roman" w:cs="Times New Roman"/>
+          <w:sz w:val="22"/>
+          <w:szCs w:val="22"/>
+        </w:rPr>
+        <w:t>”</w:t>
+      </w:r>
+      <w:r>
+        <w:rPr>
+          <w:rFonts w:ascii="Times New Roman" w:hAnsi="Times New Roman" w:cs="Times New Roman"/>
+          <w:sz w:val="22"/>
+          <w:szCs w:val="22"/>
+        </w:rPr>
+        <w:t xml:space="preserve"> instance's </w:t>
+      </w:r>
+      <w:r>
+        <w:rPr>
+          <w:rFonts w:ascii="Times New Roman" w:hAnsi="Times New Roman" w:cs="Times New Roman"/>
+          <w:sz w:val="22"/>
+          <w:szCs w:val="22"/>
+        </w:rPr>
+        <w:t>“</w:t>
       </w:r>
       <w:proofErr w:type="gramStart"/>
       <w:r>
@@ -2876,47 +3552,76 @@
           <w:sz w:val="22"/>
           <w:szCs w:val="22"/>
         </w:rPr>
-        <w:t xml:space="preserve">)” method, </w:t>
-      </w:r>
-      <w:r>
-        <w:rPr>
-          <w:rFonts w:ascii="Times New Roman" w:hAnsi="Times New Roman" w:cs="Times New Roman"/>
-          <w:sz w:val="22"/>
-          <w:szCs w:val="22"/>
-        </w:rPr>
-        <w:t>concluding with the UI updating state via “</w:t>
-      </w:r>
-      <w:proofErr w:type="spellStart"/>
-      <w:r>
-        <w:rPr>
-          <w:rFonts w:ascii="Times New Roman" w:hAnsi="Times New Roman" w:cs="Times New Roman"/>
-          <w:sz w:val="22"/>
-          <w:szCs w:val="22"/>
-        </w:rPr>
-        <w:t>setPredictionData</w:t>
-      </w:r>
-      <w:proofErr w:type="spellEnd"/>
-      <w:r>
-        <w:rPr>
-          <w:rFonts w:ascii="Times New Roman" w:hAnsi="Times New Roman" w:cs="Times New Roman"/>
-          <w:sz w:val="22"/>
-          <w:szCs w:val="22"/>
-        </w:rPr>
-        <w:t xml:space="preserve"> </w:t>
-      </w:r>
-      <w:r>
-        <w:rPr>
-          <w:rFonts w:ascii="Times New Roman" w:hAnsi="Times New Roman" w:cs="Times New Roman"/>
-          <w:sz w:val="22"/>
-          <w:szCs w:val="22"/>
-        </w:rPr>
-        <w:t xml:space="preserve">()” to declaratively render the chart. </w:t>
+        <w:t>)</w:t>
+      </w:r>
+      <w:r>
+        <w:rPr>
+          <w:rFonts w:ascii="Times New Roman" w:hAnsi="Times New Roman" w:cs="Times New Roman"/>
+          <w:sz w:val="22"/>
+          <w:szCs w:val="22"/>
+        </w:rPr>
+        <w:t>”</w:t>
+      </w:r>
+      <w:r>
+        <w:rPr>
+          <w:rFonts w:ascii="Times New Roman" w:hAnsi="Times New Roman" w:cs="Times New Roman"/>
+          <w:sz w:val="22"/>
+          <w:szCs w:val="22"/>
+        </w:rPr>
+        <w:t xml:space="preserve"> method, </w:t>
+      </w:r>
+      <w:r>
+        <w:rPr>
+          <w:rFonts w:ascii="Times New Roman" w:hAnsi="Times New Roman" w:cs="Times New Roman"/>
+          <w:sz w:val="22"/>
+          <w:szCs w:val="22"/>
+        </w:rPr>
+        <w:t xml:space="preserve">concluding with the UI updating state via </w:t>
+      </w:r>
+      <w:r>
+        <w:rPr>
+          <w:rFonts w:ascii="Times New Roman" w:hAnsi="Times New Roman" w:cs="Times New Roman"/>
+          <w:sz w:val="22"/>
+          <w:szCs w:val="22"/>
+        </w:rPr>
+        <w:t>“</w:t>
+      </w:r>
+      <w:r>
+        <w:rPr>
+          <w:rFonts w:ascii="Times New Roman" w:hAnsi="Times New Roman" w:cs="Times New Roman"/>
+          <w:sz w:val="22"/>
+          <w:szCs w:val="22"/>
+        </w:rPr>
+        <w:t xml:space="preserve">setPredictionData </w:t>
+      </w:r>
+      <w:r>
+        <w:rPr>
+          <w:rFonts w:ascii="Times New Roman" w:hAnsi="Times New Roman" w:cs="Times New Roman"/>
+          <w:sz w:val="22"/>
+          <w:szCs w:val="22"/>
+        </w:rPr>
+        <w:t>()</w:t>
+      </w:r>
+      <w:r>
+        <w:rPr>
+          <w:rFonts w:ascii="Times New Roman" w:hAnsi="Times New Roman" w:cs="Times New Roman"/>
+          <w:sz w:val="22"/>
+          <w:szCs w:val="22"/>
+        </w:rPr>
+        <w:t>”</w:t>
+      </w:r>
+      <w:r>
+        <w:rPr>
+          <w:rFonts w:ascii="Times New Roman" w:hAnsi="Times New Roman" w:cs="Times New Roman"/>
+          <w:sz w:val="22"/>
+          <w:szCs w:val="22"/>
+        </w:rPr>
+        <w:t xml:space="preserve"> to declaratively render the chart. </w:t>
       </w:r>
     </w:p>
     <w:p>
       <w:pPr>
         <w:rPr>
-          <w:rFonts w:ascii="Times New Roman" w:hAnsi="Times New Roman" w:cs="Times New Roman"/>
           <w:lang w:val="en-US"/>
         </w:rPr>
       </w:pPr>
@@ -2953,7 +3658,6 @@
         </w:rPr>
         <w:t>“</w:t>
       </w:r>
-      <w:proofErr w:type="spellStart"/>
       <w:r>
         <w:rPr>
           <w:rFonts w:ascii="Times New Roman" w:hAnsi="Times New Roman" w:cs="Times New Roman"/>
@@ -2962,7 +3666,6 @@
         </w:rPr>
         <w:t>PredictionModel</w:t>
       </w:r>
-      <w:proofErr w:type="spellEnd"/>
       <w:r>
         <w:rPr>
           <w:rFonts w:ascii="Times New Roman" w:hAnsi="Times New Roman" w:cs="Times New Roman"/>
@@ -2984,7 +3687,6 @@
     <w:p>
       <w:pPr>
         <w:rPr>
-          <w:rFonts w:ascii="Times New Roman" w:hAnsi="Times New Roman" w:cs="Times New Roman"/>
           <w:lang w:val="en-US"/>
         </w:rPr>
       </w:pPr>
@@ -3004,7 +3706,31 @@
           <w:sz w:val="22"/>
           <w:szCs w:val="22"/>
         </w:rPr>
-        <w:t>3.4 Database Design and Design Choices</w:t>
+        <w:t>3.</w:t>
+      </w:r>
+      <w:r>
+        <w:rPr>
+          <w:rFonts w:ascii="Times New Roman" w:hAnsi="Times New Roman" w:cs="Times New Roman" w:hint="eastAsia"/>
+          <w:sz w:val="22"/>
+          <w:szCs w:val="22"/>
+        </w:rPr>
+        <w:t>4</w:t>
+      </w:r>
+      <w:r>
+        <w:rPr>
+          <w:rFonts w:ascii="Times New Roman" w:hAnsi="Times New Roman" w:cs="Times New Roman"/>
+          <w:sz w:val="22"/>
+          <w:szCs w:val="22"/>
+        </w:rPr>
+        <w:t xml:space="preserve"> </w:t>
+      </w:r>
+      <w:r>
+        <w:rPr>
+          <w:rFonts w:ascii="Times New Roman" w:hAnsi="Times New Roman" w:cs="Times New Roman"/>
+          <w:sz w:val="22"/>
+          <w:szCs w:val="22"/>
+        </w:rPr>
+        <w:t>Database Design and Design Choices</w:t>
       </w:r>
     </w:p>
     <w:p>
@@ -3012,13 +3738,11 @@
         <w:keepNext/>
         <w:jc w:val="center"/>
         <w:rPr>
-          <w:rFonts w:ascii="Times New Roman" w:hAnsi="Times New Roman" w:cs="Times New Roman"/>
-          <w:lang w:val="en-US"/>
-        </w:rPr>
-      </w:pPr>
-      <w:r>
-        <w:rPr>
-          <w:rFonts w:ascii="Times New Roman" w:hAnsi="Times New Roman" w:cs="Times New Roman"/>
+          <w:lang w:val="en-US"/>
+        </w:rPr>
+      </w:pPr>
+      <w:r>
+        <w:rPr>
           <w:noProof/>
         </w:rPr>
         <w:drawing>
@@ -3063,78 +3787,30 @@
         <w:pStyle w:val="Caption"/>
         <w:jc w:val="center"/>
         <w:rPr>
-          <w:rFonts w:ascii="Times New Roman" w:hAnsi="Times New Roman" w:cs="Times New Roman"/>
-          <w:lang w:val="en-US"/>
-        </w:rPr>
-      </w:pPr>
-      <w:r>
-        <w:rPr>
-          <w:rFonts w:ascii="Times New Roman" w:hAnsi="Times New Roman" w:cs="Times New Roman"/>
-        </w:rPr>
+          <w:lang w:val="en-US"/>
+        </w:rPr>
+      </w:pPr>
+      <w:r>
         <w:t xml:space="preserve">Figure </w:t>
       </w:r>
       <w:r>
-        <w:rPr>
-          <w:rFonts w:ascii="Times New Roman" w:hAnsi="Times New Roman" w:cs="Times New Roman"/>
-        </w:rPr>
         <w:t>3.</w:t>
       </w:r>
-      <w:r>
-        <w:rPr>
-          <w:rFonts w:ascii="Times New Roman" w:hAnsi="Times New Roman" w:cs="Times New Roman"/>
-        </w:rPr>
-        <w:fldChar w:fldCharType="begin"/>
-      </w:r>
-      <w:r>
-        <w:rPr>
-          <w:rFonts w:ascii="Times New Roman" w:hAnsi="Times New Roman" w:cs="Times New Roman"/>
-        </w:rPr>
-        <w:instrText xml:space="preserve"> SEQ Figure \* ARABIC </w:instrText>
-      </w:r>
-      <w:r>
-        <w:rPr>
-          <w:rFonts w:ascii="Times New Roman" w:hAnsi="Times New Roman" w:cs="Times New Roman"/>
-        </w:rPr>
-        <w:fldChar w:fldCharType="separate"/>
-      </w:r>
-      <w:r>
-        <w:rPr>
-          <w:rFonts w:ascii="Times New Roman" w:hAnsi="Times New Roman" w:cs="Times New Roman"/>
-          <w:noProof/>
-        </w:rPr>
-        <w:t>8</w:t>
-      </w:r>
-      <w:r>
-        <w:rPr>
-          <w:rFonts w:ascii="Times New Roman" w:hAnsi="Times New Roman" w:cs="Times New Roman"/>
-          <w:noProof/>
-        </w:rPr>
-        <w:fldChar w:fldCharType="end"/>
-      </w:r>
-      <w:r>
-        <w:rPr>
-          <w:rFonts w:ascii="Times New Roman" w:hAnsi="Times New Roman" w:cs="Times New Roman"/>
-        </w:rPr>
-        <w:t xml:space="preserve"> </w:t>
-      </w:r>
-      <w:r>
-        <w:rPr>
-          <w:rFonts w:ascii="Times New Roman" w:hAnsi="Times New Roman" w:cs="Times New Roman"/>
-          <w:sz w:val="16"/>
-          <w:szCs w:val="16"/>
-        </w:rPr>
-        <w:t>Entity</w:t>
-      </w:r>
-      <w:r>
-        <w:rPr>
-          <w:rFonts w:ascii="Times New Roman" w:hAnsi="Times New Roman" w:cs="Times New Roman"/>
-        </w:rPr>
-        <w:t xml:space="preserve"> </w:t>
-      </w:r>
-      <w:r>
-        <w:rPr>
-          <w:rFonts w:ascii="Times New Roman" w:hAnsi="Times New Roman" w:cs="Times New Roman"/>
-        </w:rPr>
+      <w:fldSimple w:instr=" SEQ Figure \* ARABIC ">
+        <w:r>
+          <w:rPr>
+            <w:noProof/>
+          </w:rPr>
+          <w:t>8</w:t>
+        </w:r>
+      </w:fldSimple>
+      <w:r>
+        <w:rPr>
+          <w:rFonts w:hint="eastAsia"/>
+        </w:rPr>
+        <w:t xml:space="preserve"> Entity </w:t>
+      </w:r>
+      <w:r>
         <w:t>Relationship</w:t>
       </w:r>
     </w:p>
@@ -3153,7 +3829,23 @@
           <w:sz w:val="22"/>
           <w:szCs w:val="22"/>
         </w:rPr>
-        <w:t>Managed AWS RDS (Relational Cloud SQL): We opted for a cloud-managed Relational Database (AWS RDS for MySQL) rather than a local SQLite file or NoSQL. Shared bike systems and meteorological data are highly structured datasets. Given that the Machine Learning model</w:t>
+        <w:t>Managed AWS RDS (Relational Cloud SQL):</w:t>
+      </w:r>
+      <w:r>
+        <w:rPr>
+          <w:rFonts w:ascii="Times New Roman" w:hAnsi="Times New Roman" w:cs="Times New Roman" w:hint="eastAsia"/>
+          <w:sz w:val="22"/>
+          <w:szCs w:val="22"/>
+        </w:rPr>
+        <w:t xml:space="preserve"> </w:t>
+      </w:r>
+      <w:r>
+        <w:rPr>
+          <w:rFonts w:ascii="Times New Roman" w:hAnsi="Times New Roman" w:cs="Times New Roman"/>
+          <w:sz w:val="22"/>
+          <w:szCs w:val="22"/>
+        </w:rPr>
+        <w:t>We opted for a cloud-managed Relational Database (AWS RDS for MySQL) rather than a local SQLite file or NoSQL. Shared bike systems and meteorological data are highly structured datasets. Given that the Machine Learning model</w:t>
       </w:r>
       <w:r>
         <w:rPr>
@@ -3169,7 +3861,39 @@
           <w:sz w:val="22"/>
           <w:szCs w:val="22"/>
         </w:rPr>
-        <w:t>ing pipeline requires performing time-series transformations and heavy “JOIN” operations across station IDs and timestamps, a robust cloud SQL environment was naturally the correct fit.</w:t>
+        <w:t xml:space="preserve">ing pipeline requires performing time-series transformations and heavy </w:t>
+      </w:r>
+      <w:r>
+        <w:rPr>
+          <w:rFonts w:ascii="Times New Roman" w:hAnsi="Times New Roman" w:cs="Times New Roman" w:hint="eastAsia"/>
+          <w:sz w:val="22"/>
+          <w:szCs w:val="22"/>
+        </w:rPr>
+        <w:t>“</w:t>
+      </w:r>
+      <w:r>
+        <w:rPr>
+          <w:rFonts w:ascii="Times New Roman" w:hAnsi="Times New Roman" w:cs="Times New Roman"/>
+          <w:sz w:val="22"/>
+          <w:szCs w:val="22"/>
+        </w:rPr>
+        <w:t>JOIN</w:t>
+      </w:r>
+      <w:r>
+        <w:rPr>
+          <w:rFonts w:ascii="Times New Roman" w:hAnsi="Times New Roman" w:cs="Times New Roman" w:hint="eastAsia"/>
+          <w:sz w:val="22"/>
+          <w:szCs w:val="22"/>
+        </w:rPr>
+        <w:t>”</w:t>
+      </w:r>
+      <w:r>
+        <w:rPr>
+          <w:rFonts w:ascii="Times New Roman" w:hAnsi="Times New Roman" w:cs="Times New Roman"/>
+          <w:sz w:val="22"/>
+          <w:szCs w:val="22"/>
+        </w:rPr>
+        <w:t xml:space="preserve"> operations across station IDs and timestamps, a robust cloud SQL environment was naturally the correct fit.</w:t>
       </w:r>
     </w:p>
     <w:p>
@@ -3187,7 +3911,23 @@
           <w:sz w:val="22"/>
           <w:szCs w:val="22"/>
         </w:rPr>
-        <w:t>Data normalization</w:t>
+        <w:t xml:space="preserve">Data </w:t>
+      </w:r>
+      <w:r>
+        <w:rPr>
+          <w:rFonts w:ascii="Times New Roman" w:hAnsi="Times New Roman" w:cs="Times New Roman" w:hint="eastAsia"/>
+          <w:sz w:val="22"/>
+          <w:szCs w:val="22"/>
+        </w:rPr>
+        <w:t>n</w:t>
+      </w:r>
+      <w:r>
+        <w:rPr>
+          <w:rFonts w:ascii="Times New Roman" w:hAnsi="Times New Roman" w:cs="Times New Roman"/>
+          <w:sz w:val="22"/>
+          <w:szCs w:val="22"/>
+        </w:rPr>
+        <w:t>ormalization</w:t>
       </w:r>
       <w:r>
         <w:rPr>
@@ -3199,7 +3939,7 @@
       </w:r>
       <w:r>
         <w:rPr>
-          <w:rFonts w:ascii="Times New Roman" w:hAnsi="Times New Roman" w:cs="Times New Roman"/>
+          <w:rFonts w:ascii="Times New Roman" w:hAnsi="Times New Roman" w:cs="Times New Roman" w:hint="eastAsia"/>
           <w:sz w:val="22"/>
           <w:szCs w:val="22"/>
         </w:rPr>
@@ -3219,7 +3959,71 @@
           <w:sz w:val="22"/>
           <w:szCs w:val="22"/>
         </w:rPr>
-        <w:t>: Static factors like a station's latitude, longitude, and internal naming (“station”) remain constant. Instead of redundantly saving these details with every availability check, they are separated. The “availability” records highly volatile factors (every 5-10 minutes) leveraging Foreign Keys mapping back to the static tables, reducing storage footprint and read redundancy.</w:t>
+        <w:t>: Static factors like a station's latitude, longitude, and internal naming (</w:t>
+      </w:r>
+      <w:r>
+        <w:rPr>
+          <w:rFonts w:ascii="Times New Roman" w:hAnsi="Times New Roman" w:cs="Times New Roman" w:hint="eastAsia"/>
+          <w:sz w:val="22"/>
+          <w:szCs w:val="22"/>
+        </w:rPr>
+        <w:t>“</w:t>
+      </w:r>
+      <w:r>
+        <w:rPr>
+          <w:rFonts w:ascii="Times New Roman" w:hAnsi="Times New Roman" w:cs="Times New Roman"/>
+          <w:sz w:val="22"/>
+          <w:szCs w:val="22"/>
+        </w:rPr>
+        <w:t>station</w:t>
+      </w:r>
+      <w:r>
+        <w:rPr>
+          <w:rFonts w:ascii="Times New Roman" w:hAnsi="Times New Roman" w:cs="Times New Roman" w:hint="eastAsia"/>
+          <w:sz w:val="22"/>
+          <w:szCs w:val="22"/>
+        </w:rPr>
+        <w:t>”</w:t>
+      </w:r>
+      <w:r>
+        <w:rPr>
+          <w:rFonts w:ascii="Times New Roman" w:hAnsi="Times New Roman" w:cs="Times New Roman"/>
+          <w:sz w:val="22"/>
+          <w:szCs w:val="22"/>
+        </w:rPr>
+        <w:t xml:space="preserve">) remain constant. Instead of redundantly saving these details with every availability check, they are separated. The </w:t>
+      </w:r>
+      <w:r>
+        <w:rPr>
+          <w:rFonts w:ascii="Times New Roman" w:hAnsi="Times New Roman" w:cs="Times New Roman" w:hint="eastAsia"/>
+          <w:sz w:val="22"/>
+          <w:szCs w:val="22"/>
+        </w:rPr>
+        <w:t>“</w:t>
+      </w:r>
+      <w:r>
+        <w:rPr>
+          <w:rFonts w:ascii="Times New Roman" w:hAnsi="Times New Roman" w:cs="Times New Roman"/>
+          <w:sz w:val="22"/>
+          <w:szCs w:val="22"/>
+        </w:rPr>
+        <w:t>availability</w:t>
+      </w:r>
+      <w:r>
+        <w:rPr>
+          <w:rFonts w:ascii="Times New Roman" w:hAnsi="Times New Roman" w:cs="Times New Roman" w:hint="eastAsia"/>
+          <w:sz w:val="22"/>
+          <w:szCs w:val="22"/>
+        </w:rPr>
+        <w:t>”</w:t>
+      </w:r>
+      <w:r>
+        <w:rPr>
+          <w:rFonts w:ascii="Times New Roman" w:hAnsi="Times New Roman" w:cs="Times New Roman"/>
+          <w:sz w:val="22"/>
+          <w:szCs w:val="22"/>
+        </w:rPr>
+        <w:t xml:space="preserve"> records highly volatile factors (every 5-10 minutes) leveraging Foreign Keys mapping back to the static tables, reducing storage footprint and read redundancy.</w:t>
       </w:r>
     </w:p>
     <w:p>
@@ -3249,7 +4053,7 @@
       </w:r>
       <w:r>
         <w:rPr>
-          <w:rFonts w:ascii="Times New Roman" w:hAnsi="Times New Roman" w:cs="Times New Roman"/>
+          <w:rFonts w:ascii="Times New Roman" w:hAnsi="Times New Roman" w:cs="Times New Roman" w:hint="eastAsia"/>
           <w:sz w:val="22"/>
           <w:szCs w:val="22"/>
         </w:rPr>
@@ -3269,7 +4073,103 @@
           <w:sz w:val="22"/>
           <w:szCs w:val="22"/>
         </w:rPr>
-        <w:t>: Because querying time-aligned weather logs and bike availability histories spans millions of rows, we introduced specific database indexing on the “timestamp” and “number” columns. This design drastically diminished query delays when compiling features to refresh our predictive Random Forest classifiers.</w:t>
+        <w:t>:</w:t>
+      </w:r>
+      <w:r>
+        <w:rPr>
+          <w:rFonts w:ascii="Times New Roman" w:hAnsi="Times New Roman" w:cs="Times New Roman" w:hint="eastAsia"/>
+          <w:sz w:val="22"/>
+          <w:szCs w:val="22"/>
+        </w:rPr>
+        <w:t xml:space="preserve"> </w:t>
+      </w:r>
+      <w:r>
+        <w:rPr>
+          <w:rFonts w:ascii="Times New Roman" w:hAnsi="Times New Roman" w:cs="Times New Roman"/>
+          <w:sz w:val="22"/>
+          <w:szCs w:val="22"/>
+        </w:rPr>
+        <w:t xml:space="preserve">Because querying time-aligned weather logs and bike availability histories spans millions of rows, we introduced specific database indexing on the </w:t>
+      </w:r>
+      <w:r>
+        <w:rPr>
+          <w:rFonts w:ascii="Times New Roman" w:hAnsi="Times New Roman" w:cs="Times New Roman" w:hint="eastAsia"/>
+          <w:sz w:val="22"/>
+          <w:szCs w:val="22"/>
+        </w:rPr>
+        <w:t>“</w:t>
+      </w:r>
+      <w:r>
+        <w:rPr>
+          <w:rFonts w:ascii="Times New Roman" w:hAnsi="Times New Roman" w:cs="Times New Roman"/>
+          <w:sz w:val="22"/>
+          <w:szCs w:val="22"/>
+        </w:rPr>
+        <w:t>timestamp</w:t>
+      </w:r>
+      <w:r>
+        <w:rPr>
+          <w:rFonts w:ascii="Times New Roman" w:hAnsi="Times New Roman" w:cs="Times New Roman" w:hint="eastAsia"/>
+          <w:sz w:val="22"/>
+          <w:szCs w:val="22"/>
+        </w:rPr>
+        <w:t>”</w:t>
+      </w:r>
+      <w:r>
+        <w:rPr>
+          <w:rFonts w:ascii="Times New Roman" w:hAnsi="Times New Roman" w:cs="Times New Roman"/>
+          <w:sz w:val="22"/>
+          <w:szCs w:val="22"/>
+        </w:rPr>
+        <w:t xml:space="preserve"> and </w:t>
+      </w:r>
+      <w:r>
+        <w:rPr>
+          <w:rFonts w:ascii="Times New Roman" w:hAnsi="Times New Roman" w:cs="Times New Roman" w:hint="eastAsia"/>
+          <w:sz w:val="22"/>
+          <w:szCs w:val="22"/>
+        </w:rPr>
+        <w:t>“</w:t>
+      </w:r>
+      <w:r>
+        <w:rPr>
+          <w:rFonts w:ascii="Times New Roman" w:hAnsi="Times New Roman" w:cs="Times New Roman"/>
+          <w:sz w:val="22"/>
+          <w:szCs w:val="22"/>
+        </w:rPr>
+        <w:t>number</w:t>
+      </w:r>
+      <w:r>
+        <w:rPr>
+          <w:rFonts w:ascii="Times New Roman" w:hAnsi="Times New Roman" w:cs="Times New Roman" w:hint="eastAsia"/>
+          <w:sz w:val="22"/>
+          <w:szCs w:val="22"/>
+        </w:rPr>
+        <w:t>”</w:t>
+      </w:r>
+      <w:r>
+        <w:rPr>
+          <w:rFonts w:ascii="Times New Roman" w:hAnsi="Times New Roman" w:cs="Times New Roman"/>
+          <w:sz w:val="22"/>
+          <w:szCs w:val="22"/>
+        </w:rPr>
+        <w:t xml:space="preserve"> columns. This design drastically diminished query delays when compiling features to refresh our predictive </w:t>
+      </w:r>
+      <w:r>
+        <w:rPr>
+          <w:rFonts w:ascii="Times New Roman" w:hAnsi="Times New Roman" w:cs="Times New Roman"/>
+          <w:sz w:val="22"/>
+          <w:szCs w:val="22"/>
+        </w:rPr>
+        <w:t>Decision Tree</w:t>
+      </w:r>
+      <w:r>
+        <w:rPr>
+          <w:rFonts w:ascii="Times New Roman" w:hAnsi="Times New Roman" w:cs="Times New Roman"/>
+          <w:sz w:val="22"/>
+          <w:szCs w:val="22"/>
+        </w:rPr>
+        <w:t xml:space="preserve"> classifiers.</w:t>
       </w:r>
     </w:p>
     <w:p>
@@ -3287,7 +4187,39 @@
           <w:sz w:val="22"/>
           <w:szCs w:val="22"/>
         </w:rPr>
-        <w:t>Stateful LLM persistence &amp; auth isolation</w:t>
+        <w:t xml:space="preserve">Stateful LLM </w:t>
+      </w:r>
+      <w:r>
+        <w:rPr>
+          <w:rFonts w:ascii="Times New Roman" w:hAnsi="Times New Roman" w:cs="Times New Roman" w:hint="eastAsia"/>
+          <w:sz w:val="22"/>
+          <w:szCs w:val="22"/>
+        </w:rPr>
+        <w:t>p</w:t>
+      </w:r>
+      <w:r>
+        <w:rPr>
+          <w:rFonts w:ascii="Times New Roman" w:hAnsi="Times New Roman" w:cs="Times New Roman"/>
+          <w:sz w:val="22"/>
+          <w:szCs w:val="22"/>
+        </w:rPr>
+        <w:t>ersistence &amp; a</w:t>
+      </w:r>
+      <w:r>
+        <w:rPr>
+          <w:rFonts w:ascii="Times New Roman" w:hAnsi="Times New Roman" w:cs="Times New Roman" w:hint="eastAsia"/>
+          <w:sz w:val="22"/>
+          <w:szCs w:val="22"/>
+        </w:rPr>
+        <w:t>u</w:t>
+      </w:r>
+      <w:r>
+        <w:rPr>
+          <w:rFonts w:ascii="Times New Roman" w:hAnsi="Times New Roman" w:cs="Times New Roman"/>
+          <w:sz w:val="22"/>
+          <w:szCs w:val="22"/>
+        </w:rPr>
+        <w:t>th isolation</w:t>
       </w:r>
       <w:r>
         <w:rPr>
@@ -3299,7 +4231,7 @@
       </w:r>
       <w:r>
         <w:rPr>
-          <w:rFonts w:ascii="Times New Roman" w:hAnsi="Times New Roman" w:cs="Times New Roman"/>
+          <w:rFonts w:ascii="Times New Roman" w:hAnsi="Times New Roman" w:cs="Times New Roman" w:hint="eastAsia"/>
           <w:sz w:val="22"/>
           <w:szCs w:val="22"/>
         </w:rPr>
@@ -3311,80 +4243,54 @@
           <w:sz w:val="22"/>
           <w:szCs w:val="22"/>
         </w:rPr>
-        <w:t>):</w:t>
-      </w:r>
-      <w:r>
-        <w:rPr>
-          <w:rFonts w:ascii="Times New Roman" w:hAnsi="Times New Roman" w:cs="Times New Roman"/>
-          <w:sz w:val="22"/>
-          <w:szCs w:val="22"/>
-        </w:rPr>
-        <w:t>: To securely expand the application beyond public bike metrics, we isolated authentication and Chatbot states via the “user”, “sessions”, and “</w:t>
-      </w:r>
-      <w:proofErr w:type="spellStart"/>
-      <w:r>
-        <w:rPr>
-          <w:rFonts w:ascii="Times New Roman" w:hAnsi="Times New Roman" w:cs="Times New Roman"/>
-          <w:sz w:val="22"/>
-          <w:szCs w:val="22"/>
-        </w:rPr>
-        <w:t>message_store</w:t>
-      </w:r>
-      <w:proofErr w:type="spellEnd"/>
-      <w:r>
-        <w:rPr>
-          <w:rFonts w:ascii="Times New Roman" w:hAnsi="Times New Roman" w:cs="Times New Roman"/>
-          <w:sz w:val="22"/>
-          <w:szCs w:val="22"/>
-        </w:rPr>
-        <w:t xml:space="preserve">” tables. The “user” records enforce robust identity and JWT validations, mapped via foreign key explicitly to Chatbot metadata (“sessions”). To accommodate the vast, unpredictable text structure characteristic of Large Language Models via </w:t>
-      </w:r>
-      <w:proofErr w:type="spellStart"/>
-      <w:r>
-        <w:rPr>
-          <w:rFonts w:ascii="Times New Roman" w:hAnsi="Times New Roman" w:cs="Times New Roman"/>
-          <w:sz w:val="22"/>
-          <w:szCs w:val="22"/>
-        </w:rPr>
-        <w:t>LangChain</w:t>
-      </w:r>
-      <w:proofErr w:type="spellEnd"/>
-      <w:r>
-        <w:rPr>
-          <w:rFonts w:ascii="Times New Roman" w:hAnsi="Times New Roman" w:cs="Times New Roman"/>
-          <w:sz w:val="22"/>
-          <w:szCs w:val="22"/>
-        </w:rPr>
-        <w:t>, the “</w:t>
-      </w:r>
-      <w:proofErr w:type="spellStart"/>
-      <w:r>
-        <w:rPr>
-          <w:rFonts w:ascii="Times New Roman" w:hAnsi="Times New Roman" w:cs="Times New Roman"/>
-          <w:sz w:val="22"/>
-          <w:szCs w:val="22"/>
-        </w:rPr>
-        <w:t>message_store</w:t>
-      </w:r>
-      <w:proofErr w:type="spellEnd"/>
-      <w:r>
-        <w:rPr>
-          <w:rFonts w:ascii="Times New Roman" w:hAnsi="Times New Roman" w:cs="Times New Roman"/>
-          <w:sz w:val="22"/>
-          <w:szCs w:val="22"/>
-        </w:rPr>
-        <w:t>” table purposefully archives deep ongoing chat interactions leveraging native JSON columns.</w:t>
+        <w:t>)</w:t>
+      </w:r>
+      <w:r>
+        <w:rPr>
+          <w:rFonts w:ascii="Times New Roman" w:hAnsi="Times New Roman" w:cs="Times New Roman"/>
+          <w:sz w:val="22"/>
+          <w:szCs w:val="22"/>
+        </w:rPr>
+        <w:t>:</w:t>
+      </w:r>
+      <w:r>
+        <w:rPr>
+          <w:rFonts w:ascii="Times New Roman" w:hAnsi="Times New Roman" w:cs="Times New Roman"/>
+          <w:sz w:val="22"/>
+          <w:szCs w:val="22"/>
+        </w:rPr>
+        <w:t>: To securely expand the application beyond public bike metrics, we isolated authentication and Chatbot states via the “user”, “sessions”, and “message_store” tables. The “user” records enforce robust identity and JWT validations, mapped via foreign key explicitly to Chatbot metadata (“sessions”). To accommodate the vast, unpredictable text structure characteristic of Large Language Models via LangChain, the “message_store” table purposefully archives deep ongoing chat interactions leveraging native JSON columns.</w:t>
+      </w:r>
+    </w:p>
+    <w:p/>
+    <w:p>
+      <w:pPr>
+        <w:spacing w:line="240" w:lineRule="auto"/>
+        <w:rPr>
+          <w:rFonts w:ascii="Times New Roman" w:hAnsi="Times New Roman" w:cs="Times New Roman"/>
+          <w:sz w:val="22"/>
+          <w:szCs w:val="22"/>
+        </w:rPr>
+      </w:pPr>
+      <w:r>
+        <w:rPr>
+          <w:rFonts w:ascii="Times New Roman" w:hAnsi="Times New Roman" w:cs="Times New Roman" w:hint="eastAsia"/>
+          <w:sz w:val="22"/>
+          <w:szCs w:val="22"/>
+        </w:rPr>
+        <w:t xml:space="preserve">3.5 </w:t>
+      </w:r>
+      <w:r>
+        <w:rPr>
+          <w:rFonts w:ascii="Times New Roman" w:hAnsi="Times New Roman" w:cs="Times New Roman"/>
+          <w:sz w:val="22"/>
+          <w:szCs w:val="22"/>
+        </w:rPr>
+        <w:t>Additional Material</w:t>
       </w:r>
     </w:p>
     <w:p>
       <w:pPr>
-        <w:rPr>
-          <w:rFonts w:ascii="Times New Roman" w:hAnsi="Times New Roman" w:cs="Times New Roman"/>
-        </w:rPr>
-      </w:pPr>
-    </w:p>
-    <w:p>
-      <w:pPr>
         <w:spacing w:line="240" w:lineRule="auto"/>
         <w:rPr>
           <w:rFonts w:ascii="Times New Roman" w:hAnsi="Times New Roman" w:cs="Times New Roman"/>
@@ -3398,29 +4304,11 @@
           <w:sz w:val="22"/>
           <w:szCs w:val="22"/>
         </w:rPr>
-        <w:t>3.5 Additional Material</w:t>
-      </w:r>
-    </w:p>
-    <w:p>
-      <w:pPr>
-        <w:spacing w:line="240" w:lineRule="auto"/>
-        <w:rPr>
-          <w:rFonts w:ascii="Times New Roman" w:hAnsi="Times New Roman" w:cs="Times New Roman"/>
-          <w:sz w:val="22"/>
-          <w:szCs w:val="22"/>
-        </w:rPr>
-      </w:pPr>
-      <w:r>
-        <w:rPr>
-          <w:rFonts w:ascii="Times New Roman" w:hAnsi="Times New Roman" w:cs="Times New Roman"/>
-          <w:sz w:val="22"/>
-          <w:szCs w:val="22"/>
-        </w:rPr>
         <w:t>All original UML</w:t>
       </w:r>
       <w:r>
         <w:rPr>
-          <w:rFonts w:ascii="Times New Roman" w:hAnsi="Times New Roman" w:cs="Times New Roman"/>
+          <w:rFonts w:ascii="Times New Roman" w:hAnsi="Times New Roman" w:cs="Times New Roman" w:hint="eastAsia"/>
           <w:sz w:val="22"/>
           <w:szCs w:val="22"/>
         </w:rPr>
@@ -3436,7 +4324,7 @@
       </w:r>
       <w:r>
         <w:rPr>
-          <w:rFonts w:ascii="Times New Roman" w:hAnsi="Times New Roman" w:cs="Times New Roman"/>
+          <w:rFonts w:ascii="Times New Roman" w:hAnsi="Times New Roman" w:cs="Times New Roman" w:hint="eastAsia"/>
           <w:sz w:val="22"/>
           <w:szCs w:val="22"/>
         </w:rPr>

</xml_diff>